<commit_message>
Update team names and avatars on About page; rewrite proposals in a natural tone; refresh content ZIP
</commit_message>
<xml_diff>
--- a/docs/Website-Project-Proposal.docx
+++ b/docs/Website-Project-Proposal.docx
@@ -182,7 +182,7 @@
         <w:rPr>
           <w:noProof/>
         </w:rPr>
-        <w:instrText xml:space="preserve"> PAGEREF _Toc239152175 \h </w:instrText>
+        <w:instrText xml:space="preserve"> PAGEREF _Toc239193375 \h </w:instrText>
       </w:r>
       <w:r>
         <w:rPr>
@@ -240,7 +240,7 @@
         <w:rPr>
           <w:noProof/>
         </w:rPr>
-        <w:instrText xml:space="preserve"> PAGEREF _Toc239152176 \h </w:instrText>
+        <w:instrText xml:space="preserve"> PAGEREF _Toc239193376 \h </w:instrText>
       </w:r>
       <w:r>
         <w:rPr>
@@ -298,7 +298,7 @@
         <w:rPr>
           <w:noProof/>
         </w:rPr>
-        <w:instrText xml:space="preserve"> PAGEREF _Toc239152177 \h </w:instrText>
+        <w:instrText xml:space="preserve"> PAGEREF _Toc239193377 \h </w:instrText>
       </w:r>
       <w:r>
         <w:rPr>
@@ -356,7 +356,7 @@
         <w:rPr>
           <w:noProof/>
         </w:rPr>
-        <w:instrText xml:space="preserve"> PAGEREF _Toc239152178 \h </w:instrText>
+        <w:instrText xml:space="preserve"> PAGEREF _Toc239193378 \h </w:instrText>
       </w:r>
       <w:r>
         <w:rPr>
@@ -414,7 +414,7 @@
         <w:rPr>
           <w:noProof/>
         </w:rPr>
-        <w:instrText xml:space="preserve"> PAGEREF _Toc239152179 \h </w:instrText>
+        <w:instrText xml:space="preserve"> PAGEREF _Toc239193379 \h </w:instrText>
       </w:r>
       <w:r>
         <w:rPr>
@@ -472,7 +472,7 @@
         <w:rPr>
           <w:noProof/>
         </w:rPr>
-        <w:instrText xml:space="preserve"> PAGEREF _Toc239152180 \h </w:instrText>
+        <w:instrText xml:space="preserve"> PAGEREF _Toc239193380 \h </w:instrText>
       </w:r>
       <w:r>
         <w:rPr>
@@ -530,7 +530,7 @@
         <w:rPr>
           <w:noProof/>
         </w:rPr>
-        <w:instrText xml:space="preserve"> PAGEREF _Toc239152181 \h </w:instrText>
+        <w:instrText xml:space="preserve"> PAGEREF _Toc239193381 \h </w:instrText>
       </w:r>
       <w:r>
         <w:rPr>
@@ -588,7 +588,7 @@
         <w:rPr>
           <w:noProof/>
         </w:rPr>
-        <w:instrText xml:space="preserve"> PAGEREF _Toc239152182 \h </w:instrText>
+        <w:instrText xml:space="preserve"> PAGEREF _Toc239193382 \h </w:instrText>
       </w:r>
       <w:r>
         <w:rPr>
@@ -646,7 +646,7 @@
         <w:rPr>
           <w:noProof/>
         </w:rPr>
-        <w:instrText xml:space="preserve"> PAGEREF _Toc239152183 \h </w:instrText>
+        <w:instrText xml:space="preserve"> PAGEREF _Toc239193383 \h </w:instrText>
       </w:r>
       <w:r>
         <w:rPr>
@@ -704,7 +704,7 @@
         <w:rPr>
           <w:noProof/>
         </w:rPr>
-        <w:instrText xml:space="preserve"> PAGEREF _Toc239152184 \h </w:instrText>
+        <w:instrText xml:space="preserve"> PAGEREF _Toc239193384 \h </w:instrText>
       </w:r>
       <w:r>
         <w:rPr>
@@ -762,7 +762,7 @@
         <w:rPr>
           <w:noProof/>
         </w:rPr>
-        <w:instrText xml:space="preserve"> PAGEREF _Toc239152185 \h </w:instrText>
+        <w:instrText xml:space="preserve"> PAGEREF _Toc239193385 \h </w:instrText>
       </w:r>
       <w:r>
         <w:rPr>
@@ -820,7 +820,7 @@
         <w:rPr>
           <w:noProof/>
         </w:rPr>
-        <w:instrText xml:space="preserve"> PAGEREF _Toc239152186 \h </w:instrText>
+        <w:instrText xml:space="preserve"> PAGEREF _Toc239193386 \h </w:instrText>
       </w:r>
       <w:r>
         <w:rPr>
@@ -878,7 +878,7 @@
         <w:rPr>
           <w:noProof/>
         </w:rPr>
-        <w:instrText xml:space="preserve"> PAGEREF _Toc239152187 \h </w:instrText>
+        <w:instrText xml:space="preserve"> PAGEREF _Toc239193387 \h </w:instrText>
       </w:r>
       <w:r>
         <w:rPr>
@@ -936,7 +936,7 @@
         <w:rPr>
           <w:noProof/>
         </w:rPr>
-        <w:instrText xml:space="preserve"> PAGEREF _Toc239152188 \h </w:instrText>
+        <w:instrText xml:space="preserve"> PAGEREF _Toc239193388 \h </w:instrText>
       </w:r>
       <w:r>
         <w:rPr>
@@ -994,7 +994,7 @@
         <w:rPr>
           <w:noProof/>
         </w:rPr>
-        <w:instrText xml:space="preserve"> PAGEREF _Toc239152189 \h </w:instrText>
+        <w:instrText xml:space="preserve"> PAGEREF _Toc239193389 \h </w:instrText>
       </w:r>
       <w:r>
         <w:rPr>
@@ -1052,7 +1052,7 @@
         <w:rPr>
           <w:noProof/>
         </w:rPr>
-        <w:instrText xml:space="preserve"> PAGEREF _Toc239152190 \h </w:instrText>
+        <w:instrText xml:space="preserve"> PAGEREF _Toc239193390 \h </w:instrText>
       </w:r>
       <w:r>
         <w:rPr>
@@ -1110,7 +1110,7 @@
         <w:rPr>
           <w:noProof/>
         </w:rPr>
-        <w:instrText xml:space="preserve"> PAGEREF _Toc239152191 \h </w:instrText>
+        <w:instrText xml:space="preserve"> PAGEREF _Toc239193391 \h </w:instrText>
       </w:r>
       <w:r>
         <w:rPr>
@@ -1168,7 +1168,7 @@
         <w:rPr>
           <w:noProof/>
         </w:rPr>
-        <w:instrText xml:space="preserve"> PAGEREF _Toc239152192 \h </w:instrText>
+        <w:instrText xml:space="preserve"> PAGEREF _Toc239193392 \h </w:instrText>
       </w:r>
       <w:r>
         <w:rPr>
@@ -1226,7 +1226,7 @@
         <w:rPr>
           <w:noProof/>
         </w:rPr>
-        <w:instrText xml:space="preserve"> PAGEREF _Toc239152193 \h </w:instrText>
+        <w:instrText xml:space="preserve"> PAGEREF _Toc239193393 \h </w:instrText>
       </w:r>
       <w:r>
         <w:rPr>
@@ -1284,7 +1284,7 @@
         <w:rPr>
           <w:noProof/>
         </w:rPr>
-        <w:instrText xml:space="preserve"> PAGEREF _Toc239152194 \h </w:instrText>
+        <w:instrText xml:space="preserve"> PAGEREF _Toc239193394 \h </w:instrText>
       </w:r>
       <w:r>
         <w:rPr>
@@ -1327,7 +1327,7 @@
       <w:pPr>
         <w:pStyle w:val="Heading1"/>
       </w:pPr>
-      <w:bookmarkStart w:id="0" w:name="_Toc239152175"/>
+      <w:bookmarkStart w:id="0" w:name="_Toc239193375"/>
       <w:r>
         <w:lastRenderedPageBreak/>
         <w:t>Proposal 1: VoltStream Plumbing and Electrical (Pty) Ltd</w:t>
@@ -1338,7 +1338,7 @@
       <w:pPr>
         <w:pStyle w:val="Heading2"/>
       </w:pPr>
-      <w:bookmarkStart w:id="1" w:name="_Toc239152176"/>
+      <w:bookmarkStart w:id="1" w:name="_Toc239193376"/>
       <w:r>
         <w:t>1. Organisation Overview</w:t>
       </w:r>
@@ -1351,29 +1351,29 @@
     </w:p>
     <w:p>
       <w:r>
-        <w:t>VoltStream is a family-owned services company in Sandton, Johannesburg. Founded in 2011 as a one-van plumbing service, it added electrical work in 2016, a Randburg branch in 2020 and a 24/7 emergency line in 2023. Fourteen licensed artisans complete around 900 jobs a year. (Fictional organisation presented with realistic content.)</w:t>
-      </w:r>
-    </w:p>
-    <w:p>
-      <w:r>
-        <w:t>Mission: To keep South African homes and businesses safe, powered and flowing through dependable plumbing and electrical services delivered with honesty, speed and transparent pricing.</w:t>
-      </w:r>
-    </w:p>
-    <w:p>
-      <w:r>
-        <w:t>Vision: To become Gauteng's most trusted plumbing and electrical services provider.</w:t>
-      </w:r>
-    </w:p>
-    <w:p>
-      <w:r>
-        <w:t>Target audience: Homeowners, body corporates and small businesses in Sandton, Randburg, Fourways, Bryanston and Midrand who value fast response and fixed pricing.</w:t>
+        <w:t>VoltStream is a small family-run plumbing and electrical business in Sandton. It began in 2011 when Zanele Mthembu, a qualified plumber, left her contracting job for weekend call-outs from her bakkie. Word of mouth did the rest: an electrical team in 2016, a Randburg branch in 2020, and a 24/7 emergency line today. (Fictional organisation, realistic details.)</w:t>
+      </w:r>
+    </w:p>
+    <w:p>
+      <w:r>
+        <w:t>Mission: to keep homes and businesses safe, powered and flowing through honest, fast and clearly priced work.</w:t>
+      </w:r>
+    </w:p>
+    <w:p>
+      <w:r>
+        <w:t>Vision: to be the plumbing and electrical company people in Gauteng actually recommend to their neighbours.</w:t>
+      </w:r>
+    </w:p>
+    <w:p>
+      <w:r>
+        <w:t>Target audience: homeowners, body corporates and small businesses around Sandton, Randburg, Fourways, Bryanston and Midrand.</w:t>
       </w:r>
     </w:p>
     <w:p>
       <w:pPr>
         <w:pStyle w:val="Heading2"/>
       </w:pPr>
-      <w:bookmarkStart w:id="2" w:name="_Toc239152177"/>
+      <w:bookmarkStart w:id="2" w:name="_Toc239193377"/>
       <w:r>
         <w:t>2. Website Goals and Objectives</w:t>
       </w:r>
@@ -1381,7 +1381,7 @@
     </w:p>
     <w:p>
       <w:r>
-        <w:t>The website must generate quote requests, build credibility, promote the 24/7 emergency line and support local search rankings. Key performance indicators (KPIs):</w:t>
+        <w:t>The site has to bring in quote requests, build trust, push the 24/7 emergency line and help people find the company on Google. The numbers to watch:</w:t>
       </w:r>
     </w:p>
     <w:p>
@@ -1393,7 +1393,7 @@
         </w:numPr>
       </w:pPr>
       <w:r>
-        <w:t>20+ enquiry-form submissions per month by month 3;</w:t>
+        <w:t>at least 20 quote requests a month by month 3;</w:t>
       </w:r>
     </w:p>
     <w:p>
@@ -1405,7 +1405,7 @@
         </w:numPr>
       </w:pPr>
       <w:r>
-        <w:t>60% enquiry-to-booking conversion;</w:t>
+        <w:t>60% of enquiries turning into bookings;</w:t>
       </w:r>
     </w:p>
     <w:p>
@@ -1417,7 +1417,7 @@
         </w:numPr>
       </w:pPr>
       <w:r>
-        <w:t>10+ web-originated emergency call-outs per month;</w:t>
+        <w:t>10+ emergency call-outs a month from the website;</w:t>
       </w:r>
     </w:p>
     <w:p>
@@ -1429,7 +1429,7 @@
         </w:numPr>
       </w:pPr>
       <w:r>
-        <w:t>first-page Google ranking for five target keywords by December 2026;</w:t>
+        <w:t>first-page Google results for five local search terms by December 2026;</w:t>
       </w:r>
     </w:p>
     <w:p>
@@ -1441,14 +1441,14 @@
         </w:numPr>
       </w:pPr>
       <w:r>
-        <w:t>home-page bounce rate below 45%.</w:t>
+        <w:t>home page bounce rate under 45%.</w:t>
       </w:r>
     </w:p>
     <w:p>
       <w:pPr>
         <w:pStyle w:val="Heading2"/>
       </w:pPr>
-      <w:bookmarkStart w:id="3" w:name="_Toc239152178"/>
+      <w:bookmarkStart w:id="3" w:name="_Toc239193378"/>
       <w:r>
         <w:t>3. Current Website Analysis</w:t>
       </w:r>
@@ -1456,14 +1456,14 @@
     </w:p>
     <w:p>
       <w:r>
-        <w:t>VoltStream has no website today. Strengths: strong Facebook reviews and repeat clients. Weaknesses: no Google search presence, no public pricing information and emergency leads lost after hours. The website counters these with search-optimised pages, transparent pricing and click-to-call.</w:t>
+        <w:t>VoltStream has no website yet - just Facebook reviews and word of mouth. The reviews are good, but the business is invisible in Google searches, prices are never explained in writing, and after-hours callers sometimes get a voicemail instead of a person. The website fixes all three.</w:t>
       </w:r>
     </w:p>
     <w:p>
       <w:pPr>
         <w:pStyle w:val="Heading2"/>
       </w:pPr>
-      <w:bookmarkStart w:id="4" w:name="_Toc239152179"/>
+      <w:bookmarkStart w:id="4" w:name="_Toc239193379"/>
       <w:r>
         <w:t>4. Proposed Website Features and Functionality</w:t>
       </w:r>
@@ -1471,7 +1471,7 @@
     </w:p>
     <w:p>
       <w:r>
-        <w:t>Five pages, one navigation menu:</w:t>
+        <w:t>Five pages sharing one navigation menu:</w:t>
       </w:r>
     </w:p>
     <w:p>
@@ -1483,7 +1483,7 @@
         </w:numPr>
       </w:pPr>
       <w:r>
-        <w:t>Home (index.html): hero, service summary cards, testimonials, call-to-action banner;</w:t>
+        <w:t>Home (index.html): hero image, three service cards, customer reviews and a quote button;</w:t>
       </w:r>
     </w:p>
     <w:p>
@@ -1495,7 +1495,7 @@
         </w:numPr>
       </w:pPr>
       <w:r>
-        <w:t>About Us (about.html): history, mission, vision, values, team;</w:t>
+        <w:t>About Us (about.html): story, mission, vision, values and team;</w:t>
       </w:r>
     </w:p>
     <w:p>
@@ -1508,7 +1508,7 @@
       </w:pPr>
       <w:r>
         <w:lastRenderedPageBreak/>
-        <w:t>Services (services.html): service lists, maintenance-plan pricing table, service area;</w:t>
+        <w:t>Services (services.html): service list, maintenance-plan pricing table, areas covered;</w:t>
       </w:r>
     </w:p>
     <w:p>
@@ -1520,7 +1520,7 @@
         </w:numPr>
       </w:pPr>
       <w:r>
-        <w:t>Enquiry (enquiry.html): quote request form;</w:t>
+        <w:t>Enquiry (enquiry.html): a quote request form;</w:t>
       </w:r>
     </w:p>
     <w:p>
@@ -1532,19 +1532,19 @@
         </w:numPr>
       </w:pPr>
       <w:r>
-        <w:t>Contact (contact.html): contact details and both branches (Sandton and Randburg), each with an embedded Google Map.</w:t>
-      </w:r>
-    </w:p>
-    <w:p>
-      <w:r>
-        <w:t>Part 3 adds JavaScript client-side form validation.</w:t>
+        <w:t>Contact (contact.html): numbers, hours and both branches with embedded maps.</w:t>
+      </w:r>
+    </w:p>
+    <w:p>
+      <w:r>
+        <w:t>JavaScript form validation comes in Part 3.</w:t>
       </w:r>
     </w:p>
     <w:p>
       <w:pPr>
         <w:pStyle w:val="Heading2"/>
       </w:pPr>
-      <w:bookmarkStart w:id="5" w:name="_Toc239152180"/>
+      <w:bookmarkStart w:id="5" w:name="_Toc239193380"/>
       <w:r>
         <w:t>5. Design and User Experience</w:t>
       </w:r>
@@ -1552,22 +1552,7 @@
     </w:p>
     <w:p>
       <w:r>
-        <w:t>Colour scheme: deep blue (#0B4F8A) for trust, bright orange (#F5A623) for urgency, off-white (#F7F9FB) backgrounds.</w:t>
-      </w:r>
-    </w:p>
-    <w:p>
-      <w:r>
-        <w:t>Typography: Aptos body text with bold condensed headings for a clear hierarchy.</w:t>
-      </w:r>
-    </w:p>
-    <w:p>
-      <w:r>
-        <w:t>Layout: mobile-first, card-based design with a hero image and sticky navigation.</w:t>
-      </w:r>
-    </w:p>
-    <w:p>
-      <w:r>
-        <w:t>User experience: quotes reachable within two clicks; click-to-call links on every page; descriptive alt text; WCAG AA contrast.</w:t>
+        <w:t>Deep blue (#0B4F8A) for trust, bright orange (#F5A623) for the emergency side, off-white (#F7F9FB) backgrounds. Aptos body text with bold headings. Mobile-first, card-based layout - most emergency calls come from phones. A quote is never more than two clicks away, and alt text with AA contrast is planned throughout.</w:t>
       </w:r>
     </w:p>
     <w:p>
@@ -1582,16 +1567,16 @@
         </w:rPr>
         <w:lastRenderedPageBreak/>
         <w:drawing>
-          <wp:inline distT="0" distB="0" distL="0" distR="0" wp14:anchorId="075A5957" wp14:editId="33DCE4E3">
+          <wp:inline distT="0" distB="0" distL="0" distR="0" wp14:anchorId="0BA96392" wp14:editId="57650244">
             <wp:extent cx="5731510" cy="6850380"/>
             <wp:effectExtent l="0" t="0" r="2540" b="7620"/>
-            <wp:docPr id="983836694" name="Picture 1"/>
+            <wp:docPr id="624615788" name="Picture 1"/>
             <wp:cNvGraphicFramePr/>
             <a:graphic xmlns:a="http://schemas.openxmlformats.org/drawingml/2006/main">
               <a:graphicData uri="http://schemas.openxmlformats.org/drawingml/2006/picture">
                 <pic:pic xmlns:pic="http://schemas.openxmlformats.org/drawingml/2006/picture">
                   <pic:nvPicPr>
-                    <pic:cNvPr id="983836694" name=""/>
+                    <pic:cNvPr id="624615788" name=""/>
                     <pic:cNvPicPr/>
                   </pic:nvPicPr>
                   <pic:blipFill>
@@ -1633,7 +1618,7 @@
       <w:pPr>
         <w:pStyle w:val="Heading2"/>
       </w:pPr>
-      <w:bookmarkStart w:id="6" w:name="_Toc239152181"/>
+      <w:bookmarkStart w:id="6" w:name="_Toc239193381"/>
       <w:r>
         <w:t>6. Technical Requirements</w:t>
       </w:r>
@@ -1648,7 +1633,7 @@
         </w:numPr>
       </w:pPr>
       <w:r>
-        <w:t>Languages: HTML5, CSS3 (Part 2) and JavaScript (Part 3);</w:t>
+        <w:t>HTML5, CSS3 and JavaScript - no framework needed for a site this size;</w:t>
       </w:r>
     </w:p>
     <w:p>
@@ -1660,7 +1645,7 @@
         </w:numPr>
       </w:pPr>
       <w:r>
-        <w:t>Hosting: shared cPanel hosting with SSL; domain voltstream.co.za;</w:t>
+        <w:t>shared hosting with SSL; domain voltstream.co.za;</w:t>
       </w:r>
     </w:p>
     <w:p>
@@ -1672,7 +1657,7 @@
         </w:numPr>
       </w:pPr>
       <w:r>
-        <w:t>Version control: Git with a private GitHub repository;</w:t>
+        <w:t>Git with a private GitHub repository;</w:t>
       </w:r>
     </w:p>
     <w:p>
@@ -1684,14 +1669,14 @@
         </w:numPr>
       </w:pPr>
       <w:r>
-        <w:t>Local SEO: Google Business Profile linked to the website.</w:t>
+        <w:t>a Google Business Profile for local SEO.</w:t>
       </w:r>
     </w:p>
     <w:p>
       <w:pPr>
         <w:pStyle w:val="Heading2"/>
       </w:pPr>
-      <w:bookmarkStart w:id="7" w:name="_Toc239152182"/>
+      <w:bookmarkStart w:id="7" w:name="_Toc239193382"/>
       <w:r>
         <w:lastRenderedPageBreak/>
         <w:t>7. Timeline and Milestones</w:t>
@@ -1755,14 +1740,14 @@
         </w:numPr>
       </w:pPr>
       <w:r>
-        <w:t>6 Nov 2026: final tested website submitted.</w:t>
+        <w:t>6 Nov 2026: final site submitted.</w:t>
       </w:r>
     </w:p>
     <w:p>
       <w:pPr>
         <w:pStyle w:val="Heading2"/>
       </w:pPr>
-      <w:bookmarkStart w:id="8" w:name="_Toc239152183"/>
+      <w:bookmarkStart w:id="8" w:name="_Toc239193383"/>
       <w:r>
         <w:t>8. Budget</w:t>
       </w:r>
@@ -1770,7 +1755,7 @@
     </w:p>
     <w:p>
       <w:r>
-        <w:t>Based on current South African market rates:</w:t>
+        <w:t>Current South African prices were used as a guide:</w:t>
       </w:r>
     </w:p>
     <w:p>
@@ -1782,7 +1767,7 @@
         </w:numPr>
       </w:pPr>
       <w:r>
-        <w:t>Domain (.co.za): R99 per year;</w:t>
+        <w:t>domain (.co.za): R99 a year;</w:t>
       </w:r>
     </w:p>
     <w:p>
@@ -1794,7 +1779,7 @@
         </w:numPr>
       </w:pPr>
       <w:r>
-        <w:t>Shared hosting with SSL: R149 per month (R1,788 per year);</w:t>
+        <w:t>hosting with SSL: R149 a month (R1,788 a year);</w:t>
       </w:r>
     </w:p>
     <w:p>
@@ -1806,7 +1791,7 @@
         </w:numPr>
       </w:pPr>
       <w:r>
-        <w:t>Development: R18,000 once-off at market rates (delivered as a student project at no cost);</w:t>
+        <w:t>a freelancer would charge about R18,000 for this build - the student project costs the client nothing;</w:t>
       </w:r>
     </w:p>
     <w:p>
@@ -1818,7 +1803,7 @@
         </w:numPr>
       </w:pPr>
       <w:r>
-        <w:t>Logo and branding: R1,500 once-off;</w:t>
+        <w:t>logo refresh: R1,500 once-off;</w:t>
       </w:r>
     </w:p>
     <w:p>
@@ -1830,7 +1815,7 @@
         </w:numPr>
       </w:pPr>
       <w:r>
-        <w:t>Maintenance: R600 per month; SEO support: R1,200 per month;</w:t>
+        <w:t>maintenance R600 a month; SEO support R1,200 a month;</w:t>
       </w:r>
     </w:p>
     <w:p>
@@ -1842,14 +1827,14 @@
         </w:numPr>
       </w:pPr>
       <w:r>
-        <w:t>Estimated year-one total: approximately R24,800.</w:t>
+        <w:t>year one: roughly R24,800, excluding paid ads.</w:t>
       </w:r>
     </w:p>
     <w:p>
       <w:pPr>
         <w:pStyle w:val="Heading2"/>
       </w:pPr>
-      <w:bookmarkStart w:id="9" w:name="_Toc239152184"/>
+      <w:bookmarkStart w:id="9" w:name="_Toc239193384"/>
       <w:r>
         <w:t>9. References</w:t>
       </w:r>
@@ -1915,7 +1900,7 @@
       <w:pPr>
         <w:pStyle w:val="Heading1"/>
       </w:pPr>
-      <w:bookmarkStart w:id="10" w:name="_Toc239152185"/>
+      <w:bookmarkStart w:id="10" w:name="_Toc239193385"/>
       <w:r>
         <w:lastRenderedPageBreak/>
         <w:t>Proposal 2: Paws of Hope Animal Shelter (NPO)</w:t>
@@ -1926,7 +1911,7 @@
       <w:pPr>
         <w:pStyle w:val="Heading2"/>
       </w:pPr>
-      <w:bookmarkStart w:id="11" w:name="_Toc239152186"/>
+      <w:bookmarkStart w:id="11" w:name="_Toc239193386"/>
       <w:r>
         <w:t>1. Organisation Overview</w:t>
       </w:r>
@@ -1939,29 +1924,29 @@
     </w:p>
     <w:p>
       <w:r>
-        <w:t>Paws of Hope is a no-kill shelter founded in 2015 by volunteers in Randburg, Johannesburg. It has rescued, rehabilitated and rehomed more than 400 dogs and cats, operating from donated premises and 30 foster homes, funded by donations, adoption fees and fundraising events. (Fictional organisation presented with realistic content.)</w:t>
-      </w:r>
-    </w:p>
-    <w:p>
-      <w:r>
-        <w:t>Mission: To rescue, rehabilitate and rehome abandoned animals and educate the community on responsible pet ownership.</w:t>
-      </w:r>
-    </w:p>
-    <w:p>
-      <w:r>
-        <w:t>Vision: A Gauteng where every adoptable animal finds a loving home.</w:t>
-      </w:r>
-    </w:p>
-    <w:p>
-      <w:r>
-        <w:t>Target audience: Potential adopters and foster families, volunteers, corporate CSI sponsors, schools and individual donors.</w:t>
+        <w:t>Paws of Hope is a small no-kill shelter in Randburg run almost entirely by volunteers. It opened in 2015 when a few friends started fostering strays from their homes; since then it has rehomed more than 400 dogs and cats with the help of about 30 foster families. Donations, adoption fees and fundraisers keep the doors open. (Fictional organisation, realistic details.)</w:t>
+      </w:r>
+    </w:p>
+    <w:p>
+      <w:r>
+        <w:t>Mission: to rescue, rehabilitate and rehome abandoned animals, and to teach people about responsible pet ownership.</w:t>
+      </w:r>
+    </w:p>
+    <w:p>
+      <w:r>
+        <w:t>Vision: a Gauteng where every adoptable animal finds a home.</w:t>
+      </w:r>
+    </w:p>
+    <w:p>
+      <w:r>
+        <w:t>Target audience: people looking to adopt or foster, volunteers, companies searching for CSI projects, schools and donors.</w:t>
       </w:r>
     </w:p>
     <w:p>
       <w:pPr>
         <w:pStyle w:val="Heading2"/>
       </w:pPr>
-      <w:bookmarkStart w:id="12" w:name="_Toc239152187"/>
+      <w:bookmarkStart w:id="12" w:name="_Toc239193387"/>
       <w:r>
         <w:t>2. Website Goals and Objectives</w:t>
       </w:r>
@@ -1969,7 +1954,7 @@
     </w:p>
     <w:p>
       <w:r>
-        <w:t>The website must convert three visitor groups: adopters, volunteers and sponsors. Key performance indicators (KPIs):</w:t>
+        <w:t>The website has to convert three groups of visitors: adopters, volunteers and sponsors. The numbers to track are:</w:t>
       </w:r>
     </w:p>
     <w:p>
@@ -1981,7 +1966,7 @@
         </w:numPr>
       </w:pPr>
       <w:r>
-        <w:t>8+ adoption applications per month;</w:t>
+        <w:t>8 or more adoption applications a month;</w:t>
       </w:r>
     </w:p>
     <w:p>
@@ -1993,7 +1978,7 @@
         </w:numPr>
       </w:pPr>
       <w:r>
-        <w:t>15 volunteer registrations per month;</w:t>
+        <w:t>15 new volunteer sign-ups a month;</w:t>
       </w:r>
     </w:p>
     <w:p>
@@ -2005,7 +1990,7 @@
         </w:numPr>
       </w:pPr>
       <w:r>
-        <w:t>R15,000 in recurring monthly donations by month 6;</w:t>
+        <w:t>R15,000 a month in recurring donations by month 6;</w:t>
       </w:r>
     </w:p>
     <w:p>
@@ -2017,7 +2002,7 @@
         </w:numPr>
       </w:pPr>
       <w:r>
-        <w:t>200 newsletter sign-ups by December 2026;</w:t>
+        <w:t>200 newsletter subscribers by December 2026;</w:t>
       </w:r>
     </w:p>
     <w:p>
@@ -2029,14 +2014,14 @@
         </w:numPr>
       </w:pPr>
       <w:r>
-        <w:t>3 corporate sponsorship enquiries per quarter.</w:t>
+        <w:t>3 corporate sponsorship enquiries a quarter.</w:t>
       </w:r>
     </w:p>
     <w:p>
       <w:pPr>
         <w:pStyle w:val="Heading2"/>
       </w:pPr>
-      <w:bookmarkStart w:id="13" w:name="_Toc239152188"/>
+      <w:bookmarkStart w:id="13" w:name="_Toc239193388"/>
       <w:r>
         <w:t>3. Current Website Analysis</w:t>
       </w:r>
@@ -2044,14 +2029,14 @@
     </w:p>
     <w:p>
       <w:r>
-        <w:t>Paws of Hope communicates through Instagram and Facebook only. Strengths: engaging adoption stories and an active community. Weaknesses: no structured adoption process, no single donation or volunteer page, and key information buried in comments.</w:t>
+        <w:t>The shelter only uses Instagram and Facebook today. The adoption stories work well, but there is no adoption process online, no single page for donations or volunteering, and common questions end up buried in comments. A website gives each of those a permanent home.</w:t>
       </w:r>
     </w:p>
     <w:p>
       <w:pPr>
         <w:pStyle w:val="Heading2"/>
       </w:pPr>
-      <w:bookmarkStart w:id="14" w:name="_Toc239152189"/>
+      <w:bookmarkStart w:id="14" w:name="_Toc239193389"/>
       <w:r>
         <w:t>4. Proposed Website Features and Functionality</w:t>
       </w:r>
@@ -2059,7 +2044,7 @@
     </w:p>
     <w:p>
       <w:r>
-        <w:t>Five pages, one navigation menu:</w:t>
+        <w:t>Five pages, one menu:</w:t>
       </w:r>
     </w:p>
     <w:p>
@@ -2071,7 +2056,7 @@
         </w:numPr>
       </w:pPr>
       <w:r>
-        <w:t>Home (index.html): hero mission statement, three action cards (Adopt, Volunteer, Sponsor), success stories;</w:t>
+        <w:t>Home (index.html): mission statement, three action cards (Adopt, Volunteer, Sponsor), success stories;</w:t>
       </w:r>
     </w:p>
     <w:p>
@@ -2083,7 +2068,7 @@
         </w:numPr>
       </w:pPr>
       <w:r>
-        <w:t>About Us (about.html): history, mission, vision, values, volunteer team;</w:t>
+        <w:t>About Us (about.html): the shelter's story, mission and people;</w:t>
       </w:r>
     </w:p>
     <w:p>
@@ -2096,7 +2081,7 @@
       </w:pPr>
       <w:r>
         <w:lastRenderedPageBreak/>
-        <w:t>Adopt (services.html equivalent): adoption process, what adoption includes, animal gallery placeholder;</w:t>
+        <w:t>Adopt (services.html equivalent): adoption steps, what adoption includes, animal gallery;</w:t>
       </w:r>
     </w:p>
     <w:p>
@@ -2108,7 +2093,7 @@
         </w:numPr>
       </w:pPr>
       <w:r>
-        <w:t>Enquiry (enquiry.html): one form to enquire about adopting, volunteering or sponsoring;</w:t>
+        <w:t>Enquiry (enquiry.html): one form for adopting, volunteering or sponsoring;</w:t>
       </w:r>
     </w:p>
     <w:p>
@@ -2120,19 +2105,19 @@
         </w:numPr>
       </w:pPr>
       <w:r>
-        <w:t>Contact (contact.html): shelter details and two locations (main shelter in Randburg, adoption-day venue in Sandton), each with an embedded Google Map.</w:t>
-      </w:r>
-    </w:p>
-    <w:p>
-      <w:r>
-        <w:t>Part 3 adds JavaScript validation and donation buttons (PayFast or SnapScan).</w:t>
+        <w:t>Contact (contact.html): details and two locations (Randburg shelter, Sandton adoption venue), each with a map.</w:t>
+      </w:r>
+    </w:p>
+    <w:p>
+      <w:r>
+        <w:t>Donation buttons (PayFast or SnapScan) and form validation are planned for Part 3.</w:t>
       </w:r>
     </w:p>
     <w:p>
       <w:pPr>
         <w:pStyle w:val="Heading2"/>
       </w:pPr>
-      <w:bookmarkStart w:id="15" w:name="_Toc239152190"/>
+      <w:bookmarkStart w:id="15" w:name="_Toc239193390"/>
       <w:r>
         <w:t>5. Design and User Experience</w:t>
       </w:r>
@@ -2140,22 +2125,7 @@
     </w:p>
     <w:p>
       <w:r>
-        <w:t>Colour scheme: warm teal (#2E8B7A) for compassion, soft amber (#F2B705) for hope, cream (#FBF7EF) backgrounds.</w:t>
-      </w:r>
-    </w:p>
-    <w:p>
-      <w:r>
-        <w:t>Typography: a rounded, friendly heading font with readable Aptos body text.</w:t>
-      </w:r>
-    </w:p>
-    <w:p>
-      <w:r>
-        <w:t>Layout: story-first with three action cards and generous white space; mobile-first, as most social-media visitors arrive on phones.</w:t>
-      </w:r>
-    </w:p>
-    <w:p>
-      <w:r>
-        <w:t>User experience: adoption enquiry within three clicks; one shared form with a purpose selector; descriptive alt text throughout.</w:t>
+        <w:t>Warm teal (#2E8B7A), soft amber (#F2B705) and cream (#FBF7EF) - calm, not corporate. Rounded headings with Aptos body text. Story-first layout with big animal photos, three action cards and breathing room; mobile-first because most visitors come from social media. Adoption enquiries within three clicks; descriptive alt text throughout.</w:t>
       </w:r>
     </w:p>
     <w:p>
@@ -2170,16 +2140,16 @@
         </w:rPr>
         <w:lastRenderedPageBreak/>
         <w:drawing>
-          <wp:inline distT="0" distB="0" distL="0" distR="0" wp14:anchorId="47C5F58D" wp14:editId="653DDEFD">
+          <wp:inline distT="0" distB="0" distL="0" distR="0" wp14:anchorId="1D317BBA" wp14:editId="329F80A8">
             <wp:extent cx="5731510" cy="6850380"/>
             <wp:effectExtent l="0" t="0" r="2540" b="7620"/>
-            <wp:docPr id="1038914544" name="Picture 2"/>
+            <wp:docPr id="1268794818" name="Picture 2"/>
             <wp:cNvGraphicFramePr/>
             <a:graphic xmlns:a="http://schemas.openxmlformats.org/drawingml/2006/main">
               <a:graphicData uri="http://schemas.openxmlformats.org/drawingml/2006/picture">
                 <pic:pic xmlns:pic="http://schemas.openxmlformats.org/drawingml/2006/picture">
                   <pic:nvPicPr>
-                    <pic:cNvPr id="1038914544" name=""/>
+                    <pic:cNvPr id="1268794818" name=""/>
                     <pic:cNvPicPr/>
                   </pic:nvPicPr>
                   <pic:blipFill>
@@ -2221,7 +2191,7 @@
       <w:pPr>
         <w:pStyle w:val="Heading2"/>
       </w:pPr>
-      <w:bookmarkStart w:id="16" w:name="_Toc239152191"/>
+      <w:bookmarkStart w:id="16" w:name="_Toc239193391"/>
       <w:r>
         <w:t>6. Technical Requirements</w:t>
       </w:r>
@@ -2236,7 +2206,7 @@
         </w:numPr>
       </w:pPr>
       <w:r>
-        <w:t>Languages: HTML5, CSS3 and JavaScript (static site keeps costs low);</w:t>
+        <w:t>HTML5, CSS3 and JavaScript - a static site keeps costs low;</w:t>
       </w:r>
     </w:p>
     <w:p>
@@ -2248,7 +2218,7 @@
         </w:numPr>
       </w:pPr>
       <w:r>
-        <w:t>Hosting: shared hosting with SSL; .org.za domain;</w:t>
+        <w:t>shared hosting with SSL and a .org.za domain;</w:t>
       </w:r>
     </w:p>
     <w:p>
@@ -2260,7 +2230,7 @@
         </w:numPr>
       </w:pPr>
       <w:r>
-        <w:t>Google for Nonprofits: free Workspace and Ad Grants eligibility to be explored;</w:t>
+        <w:t>Google for Nonprofits is worth applying for - free Workspace and Ad Grants;</w:t>
       </w:r>
     </w:p>
     <w:p>
@@ -2272,7 +2242,7 @@
         </w:numPr>
       </w:pPr>
       <w:r>
-        <w:t>Version control: Git with a private GitHub repository.</w:t>
+        <w:t>Git with a private GitHub repository;</w:t>
       </w:r>
     </w:p>
     <w:p>
@@ -2284,14 +2254,14 @@
         </w:numPr>
       </w:pPr>
       <w:r>
-        <w:t>Payments: PayFast or SnapScan donation buttons (Part 3).</w:t>
+        <w:t>PayFast or SnapScan buttons for donations (Part 3).</w:t>
       </w:r>
     </w:p>
     <w:p>
       <w:pPr>
         <w:pStyle w:val="Heading2"/>
       </w:pPr>
-      <w:bookmarkStart w:id="17" w:name="_Toc239152192"/>
+      <w:bookmarkStart w:id="17" w:name="_Toc239193392"/>
       <w:r>
         <w:lastRenderedPageBreak/>
         <w:t>7. Timeline and Milestones</w:t>
@@ -2355,14 +2325,14 @@
         </w:numPr>
       </w:pPr>
       <w:r>
-        <w:t>6 Nov 2026: final tested website submitted.</w:t>
+        <w:t>6 Nov 2026: final site submitted.</w:t>
       </w:r>
     </w:p>
     <w:p>
       <w:pPr>
         <w:pStyle w:val="Heading2"/>
       </w:pPr>
-      <w:bookmarkStart w:id="18" w:name="_Toc239152193"/>
+      <w:bookmarkStart w:id="18" w:name="_Toc239193393"/>
       <w:r>
         <w:t>8. Budget</w:t>
       </w:r>
@@ -2370,7 +2340,7 @@
     </w:p>
     <w:p>
       <w:r>
-        <w:t>As a non-profit, the budget targets the lowest viable running costs:</w:t>
+        <w:t>Kept deliberately low, as it should be for an NPO:</w:t>
       </w:r>
     </w:p>
     <w:p>
@@ -2382,7 +2352,7 @@
         </w:numPr>
       </w:pPr>
       <w:r>
-        <w:t>Domain (.org.za): R75 per year;</w:t>
+        <w:t>domain (.org.za): R75 a year;</w:t>
       </w:r>
     </w:p>
     <w:p>
@@ -2394,7 +2364,7 @@
         </w:numPr>
       </w:pPr>
       <w:r>
-        <w:t>Shared hosting with SSL: R99 per month (R1,188 per year);</w:t>
+        <w:t>hosting with SSL: R99 a month (R1,188 a year);</w:t>
       </w:r>
     </w:p>
     <w:p>
@@ -2406,7 +2376,7 @@
         </w:numPr>
       </w:pPr>
       <w:r>
-        <w:t>Development: R15,000 once-off at market rates (delivered as a student project at no cost);</w:t>
+        <w:t>development would cost about R15,000 commercially - the shelter gets it free as a student project;</w:t>
       </w:r>
     </w:p>
     <w:p>
@@ -2418,7 +2388,7 @@
         </w:numPr>
       </w:pPr>
       <w:r>
-        <w:t>Animal photography: R2,000 once-off;</w:t>
+        <w:t>professional photos of the animals: R2,000 once-off;</w:t>
       </w:r>
     </w:p>
     <w:p>
@@ -2430,7 +2400,7 @@
         </w:numPr>
       </w:pPr>
       <w:r>
-        <w:t>Maintenance: R300 per month; payment fees: about 3% of donations;</w:t>
+        <w:t>maintenance R300 a month; payment providers take about 3% of donations;</w:t>
       </w:r>
     </w:p>
     <w:p>
@@ -2442,14 +2412,14 @@
         </w:numPr>
       </w:pPr>
       <w:r>
-        <w:t>Estimated year-one total: approximately R7,000 plus payment fees.</w:t>
+        <w:t>year one: roughly R7,000 plus payment fees.</w:t>
       </w:r>
     </w:p>
     <w:p>
       <w:pPr>
         <w:pStyle w:val="Heading2"/>
       </w:pPr>
-      <w:bookmarkStart w:id="19" w:name="_Toc239152194"/>
+      <w:bookmarkStart w:id="19" w:name="_Toc239193394"/>
       <w:r>
         <w:t>9. References</w:t>
       </w:r>
@@ -2716,7 +2686,7 @@
 <file path=word/numbering.xml><?xml version="1.0" encoding="utf-8"?>
 <w:numbering xmlns:wpc="http://schemas.microsoft.com/office/word/2010/wordprocessingCanvas" xmlns:cx="http://schemas.microsoft.com/office/drawing/2014/chartex" xmlns:cx1="http://schemas.microsoft.com/office/drawing/2015/9/8/chartex" xmlns:cx2="http://schemas.microsoft.com/office/drawing/2015/10/21/chartex" xmlns:cx3="http://schemas.microsoft.com/office/drawing/2016/5/9/chartex" xmlns:cx4="http://schemas.microsoft.com/office/drawing/2016/5/10/chartex" xmlns:cx5="http://schemas.microsoft.com/office/drawing/2016/5/11/chartex" xmlns:cx6="http://schemas.microsoft.com/office/drawing/2016/5/12/chartex" xmlns:cx7="http://schemas.microsoft.com/office/drawing/2016/5/13/chartex" xmlns:cx8="http://schemas.microsoft.com/office/drawing/2016/5/14/chartex" xmlns:mc="http://schemas.openxmlformats.org/markup-compatibility/2006" xmlns:aink="http://schemas.microsoft.com/office/drawing/2016/ink" xmlns:am3d="http://schemas.microsoft.com/office/drawing/2017/model3d" xmlns:o="urn:schemas-microsoft-com:office:office" xmlns:oel="http://schemas.microsoft.com/office/2019/extlst" xmlns:r="http://schemas.openxmlformats.org/officeDocument/2006/relationships" xmlns:m="http://schemas.openxmlformats.org/officeDocument/2006/math" xmlns:v="urn:schemas-microsoft-com:vml" xmlns:wp14="http://schemas.microsoft.com/office/word/2010/wordprocessingDrawing" xmlns:wp="http://schemas.openxmlformats.org/drawingml/2006/wordprocessingDrawing" xmlns:w10="urn:schemas-microsoft-com:office:word" xmlns:w="http://schemas.openxmlformats.org/wordprocessingml/2006/main" xmlns:w14="http://schemas.microsoft.com/office/word/2010/wordml" xmlns:w15="http://schemas.microsoft.com/office/word/2012/wordml" xmlns:w16cex="http://schemas.microsoft.com/office/word/2018/wordml/cex" xmlns:w16cid="http://schemas.microsoft.com/office/word/2016/wordml/cid" xmlns:w16="http://schemas.microsoft.com/office/word/2018/wordml" xmlns:w16du="http://schemas.microsoft.com/office/word/2023/wordml/word16du" xmlns:w16sdtdh="http://schemas.microsoft.com/office/word/2020/wordml/sdtdatahash" xmlns:w16sdtfl="http://schemas.microsoft.com/office/word/2024/wordml/sdtformatlock" xmlns:w16se="http://schemas.microsoft.com/office/word/2015/wordml/symex" xmlns:wpg="http://schemas.microsoft.com/office/word/2010/wordprocessingGroup" xmlns:wpi="http://schemas.microsoft.com/office/word/2010/wordprocessingInk" xmlns:wne="http://schemas.microsoft.com/office/word/2006/wordml" xmlns:wps="http://schemas.microsoft.com/office/word/2010/wordprocessingShape" mc:Ignorable="w14 w15 w16se w16cid w16 w16cex w16sdtdh w16sdtfl w16du wp14">
   <w:abstractNum w:abstractNumId="0" w15:restartNumberingAfterBreak="0">
-    <w:nsid w:val="247264DD"/>
+    <w:nsid w:val="015252B6"/>
     <w:multiLevelType w:val="singleLevel"/>
     <w:tmpl w:val="1C090001"/>
     <w:lvl w:ilvl="0">
@@ -2733,7 +2703,7 @@
     </w:lvl>
   </w:abstractNum>
   <w:abstractNum w:abstractNumId="1" w15:restartNumberingAfterBreak="0">
-    <w:nsid w:val="28D76AC2"/>
+    <w:nsid w:val="06BE59FC"/>
     <w:multiLevelType w:val="singleLevel"/>
     <w:tmpl w:val="1C090001"/>
     <w:lvl w:ilvl="0">
@@ -2750,7 +2720,7 @@
     </w:lvl>
   </w:abstractNum>
   <w:abstractNum w:abstractNumId="2" w15:restartNumberingAfterBreak="0">
-    <w:nsid w:val="354A26D6"/>
+    <w:nsid w:val="13C7604C"/>
     <w:multiLevelType w:val="singleLevel"/>
     <w:tmpl w:val="1C090001"/>
     <w:lvl w:ilvl="0">
@@ -2767,7 +2737,7 @@
     </w:lvl>
   </w:abstractNum>
   <w:abstractNum w:abstractNumId="3" w15:restartNumberingAfterBreak="0">
-    <w:nsid w:val="3DA23944"/>
+    <w:nsid w:val="1C5344BE"/>
     <w:multiLevelType w:val="singleLevel"/>
     <w:tmpl w:val="1C090001"/>
     <w:lvl w:ilvl="0">
@@ -2784,7 +2754,7 @@
     </w:lvl>
   </w:abstractNum>
   <w:abstractNum w:abstractNumId="4" w15:restartNumberingAfterBreak="0">
-    <w:nsid w:val="49296AA1"/>
+    <w:nsid w:val="26FE17E7"/>
     <w:multiLevelType w:val="singleLevel"/>
     <w:tmpl w:val="1C090001"/>
     <w:lvl w:ilvl="0">
@@ -2801,7 +2771,7 @@
     </w:lvl>
   </w:abstractNum>
   <w:abstractNum w:abstractNumId="5" w15:restartNumberingAfterBreak="0">
-    <w:nsid w:val="4AD811AE"/>
+    <w:nsid w:val="34B668DF"/>
     <w:multiLevelType w:val="singleLevel"/>
     <w:tmpl w:val="1C090001"/>
     <w:lvl w:ilvl="0">
@@ -2818,7 +2788,7 @@
     </w:lvl>
   </w:abstractNum>
   <w:abstractNum w:abstractNumId="6" w15:restartNumberingAfterBreak="0">
-    <w:nsid w:val="4BFF47DF"/>
+    <w:nsid w:val="47FE1D18"/>
     <w:multiLevelType w:val="singleLevel"/>
     <w:tmpl w:val="1C090001"/>
     <w:lvl w:ilvl="0">
@@ -2835,7 +2805,7 @@
     </w:lvl>
   </w:abstractNum>
   <w:abstractNum w:abstractNumId="7" w15:restartNumberingAfterBreak="0">
-    <w:nsid w:val="6327269D"/>
+    <w:nsid w:val="56C7537E"/>
     <w:multiLevelType w:val="singleLevel"/>
     <w:tmpl w:val="1C090001"/>
     <w:lvl w:ilvl="0">
@@ -2852,7 +2822,7 @@
     </w:lvl>
   </w:abstractNum>
   <w:abstractNum w:abstractNumId="8" w15:restartNumberingAfterBreak="0">
-    <w:nsid w:val="6B3779CD"/>
+    <w:nsid w:val="65843752"/>
     <w:multiLevelType w:val="singleLevel"/>
     <w:tmpl w:val="1C090001"/>
     <w:lvl w:ilvl="0">
@@ -2869,7 +2839,7 @@
     </w:lvl>
   </w:abstractNum>
   <w:abstractNum w:abstractNumId="9" w15:restartNumberingAfterBreak="0">
-    <w:nsid w:val="6CCA43C6"/>
+    <w:nsid w:val="6C327CA5"/>
     <w:multiLevelType w:val="singleLevel"/>
     <w:tmpl w:val="1C090001"/>
     <w:lvl w:ilvl="0">
@@ -2886,7 +2856,7 @@
     </w:lvl>
   </w:abstractNum>
   <w:abstractNum w:abstractNumId="10" w15:restartNumberingAfterBreak="0">
-    <w:nsid w:val="6F097B8C"/>
+    <w:nsid w:val="739F6B36"/>
     <w:multiLevelType w:val="singleLevel"/>
     <w:tmpl w:val="1C090001"/>
     <w:lvl w:ilvl="0">
@@ -2903,7 +2873,7 @@
     </w:lvl>
   </w:abstractNum>
   <w:abstractNum w:abstractNumId="11" w15:restartNumberingAfterBreak="0">
-    <w:nsid w:val="790A4DEE"/>
+    <w:nsid w:val="757E37A8"/>
     <w:multiLevelType w:val="singleLevel"/>
     <w:tmpl w:val="1C090001"/>
     <w:lvl w:ilvl="0">
@@ -2919,41 +2889,41 @@
       </w:rPr>
     </w:lvl>
   </w:abstractNum>
-  <w:num w:numId="1" w16cid:durableId="473765123">
+  <w:num w:numId="1" w16cid:durableId="1549606032">
+    <w:abstractNumId w:val="1"/>
+  </w:num>
+  <w:num w:numId="2" w16cid:durableId="790127060">
+    <w:abstractNumId w:val="7"/>
+  </w:num>
+  <w:num w:numId="3" w16cid:durableId="1354844790">
+    <w:abstractNumId w:val="8"/>
+  </w:num>
+  <w:num w:numId="4" w16cid:durableId="1876261786">
+    <w:abstractNumId w:val="2"/>
+  </w:num>
+  <w:num w:numId="5" w16cid:durableId="1708986288">
+    <w:abstractNumId w:val="10"/>
+  </w:num>
+  <w:num w:numId="6" w16cid:durableId="1411738073">
+    <w:abstractNumId w:val="11"/>
+  </w:num>
+  <w:num w:numId="7" w16cid:durableId="228731276">
+    <w:abstractNumId w:val="3"/>
+  </w:num>
+  <w:num w:numId="8" w16cid:durableId="1057439118">
+    <w:abstractNumId w:val="4"/>
+  </w:num>
+  <w:num w:numId="9" w16cid:durableId="1352879241">
+    <w:abstractNumId w:val="9"/>
+  </w:num>
+  <w:num w:numId="10" w16cid:durableId="1498881254">
     <w:abstractNumId w:val="6"/>
   </w:num>
-  <w:num w:numId="2" w16cid:durableId="1873496801">
-    <w:abstractNumId w:val="9"/>
-  </w:num>
-  <w:num w:numId="3" w16cid:durableId="1562863317">
-    <w:abstractNumId w:val="4"/>
-  </w:num>
-  <w:num w:numId="4" w16cid:durableId="437988179">
-    <w:abstractNumId w:val="3"/>
-  </w:num>
-  <w:num w:numId="5" w16cid:durableId="680743383">
-    <w:abstractNumId w:val="8"/>
-  </w:num>
-  <w:num w:numId="6" w16cid:durableId="2022124751">
+  <w:num w:numId="11" w16cid:durableId="1212158137">
     <w:abstractNumId w:val="5"/>
   </w:num>
-  <w:num w:numId="7" w16cid:durableId="1860313008">
-    <w:abstractNumId w:val="7"/>
-  </w:num>
-  <w:num w:numId="8" w16cid:durableId="1608152281">
-    <w:abstractNumId w:val="10"/>
-  </w:num>
-  <w:num w:numId="9" w16cid:durableId="240138538">
-    <w:abstractNumId w:val="2"/>
-  </w:num>
-  <w:num w:numId="10" w16cid:durableId="11498974">
+  <w:num w:numId="12" w16cid:durableId="449668903">
     <w:abstractNumId w:val="0"/>
-  </w:num>
-  <w:num w:numId="11" w16cid:durableId="1810199236">
-    <w:abstractNumId w:val="1"/>
-  </w:num>
-  <w:num w:numId="12" w16cid:durableId="1545094898">
-    <w:abstractNumId w:val="11"/>
   </w:num>
 </w:numbering>
 </file>
@@ -3373,7 +3343,7 @@
     <w:link w:val="Heading1Char"/>
     <w:uiPriority w:val="9"/>
     <w:qFormat/>
-    <w:rsid w:val="007C5F84"/>
+    <w:rsid w:val="005B760A"/>
     <w:pPr>
       <w:keepNext/>
       <w:keepLines/>
@@ -3396,7 +3366,7 @@
     <w:uiPriority w:val="9"/>
     <w:unhideWhenUsed/>
     <w:qFormat/>
-    <w:rsid w:val="007C5F84"/>
+    <w:rsid w:val="005B760A"/>
     <w:pPr>
       <w:keepNext/>
       <w:keepLines/>
@@ -3420,7 +3390,7 @@
     <w:semiHidden/>
     <w:unhideWhenUsed/>
     <w:qFormat/>
-    <w:rsid w:val="007C5F84"/>
+    <w:rsid w:val="005B760A"/>
     <w:pPr>
       <w:keepNext/>
       <w:keepLines/>
@@ -3443,7 +3413,7 @@
     <w:semiHidden/>
     <w:unhideWhenUsed/>
     <w:qFormat/>
-    <w:rsid w:val="007C5F84"/>
+    <w:rsid w:val="005B760A"/>
     <w:pPr>
       <w:keepNext/>
       <w:keepLines/>
@@ -3466,7 +3436,7 @@
     <w:semiHidden/>
     <w:unhideWhenUsed/>
     <w:qFormat/>
-    <w:rsid w:val="007C5F84"/>
+    <w:rsid w:val="005B760A"/>
     <w:pPr>
       <w:keepNext/>
       <w:keepLines/>
@@ -3487,7 +3457,7 @@
     <w:semiHidden/>
     <w:unhideWhenUsed/>
     <w:qFormat/>
-    <w:rsid w:val="007C5F84"/>
+    <w:rsid w:val="005B760A"/>
     <w:pPr>
       <w:keepNext/>
       <w:keepLines/>
@@ -3510,7 +3480,7 @@
     <w:semiHidden/>
     <w:unhideWhenUsed/>
     <w:qFormat/>
-    <w:rsid w:val="007C5F84"/>
+    <w:rsid w:val="005B760A"/>
     <w:pPr>
       <w:keepNext/>
       <w:keepLines/>
@@ -3531,7 +3501,7 @@
     <w:semiHidden/>
     <w:unhideWhenUsed/>
     <w:qFormat/>
-    <w:rsid w:val="007C5F84"/>
+    <w:rsid w:val="005B760A"/>
     <w:pPr>
       <w:keepNext/>
       <w:keepLines/>
@@ -3554,7 +3524,7 @@
     <w:semiHidden/>
     <w:unhideWhenUsed/>
     <w:qFormat/>
-    <w:rsid w:val="007C5F84"/>
+    <w:rsid w:val="005B760A"/>
     <w:pPr>
       <w:keepNext/>
       <w:keepLines/>
@@ -3598,7 +3568,7 @@
     <w:basedOn w:val="DefaultParagraphFont"/>
     <w:link w:val="Heading1"/>
     <w:uiPriority w:val="9"/>
-    <w:rsid w:val="007C5F84"/>
+    <w:rsid w:val="005B760A"/>
     <w:rPr>
       <w:rFonts w:ascii="Aptos" w:eastAsiaTheme="majorEastAsia" w:hAnsi="Aptos" w:cstheme="majorBidi"/>
       <w:b/>
@@ -3612,7 +3582,7 @@
     <w:basedOn w:val="DefaultParagraphFont"/>
     <w:link w:val="Heading2"/>
     <w:uiPriority w:val="9"/>
-    <w:rsid w:val="007C5F84"/>
+    <w:rsid w:val="005B760A"/>
     <w:rPr>
       <w:rFonts w:ascii="Aptos" w:eastAsiaTheme="majorEastAsia" w:hAnsi="Aptos" w:cstheme="majorBidi"/>
       <w:b/>
@@ -3627,7 +3597,7 @@
     <w:link w:val="Heading3"/>
     <w:uiPriority w:val="9"/>
     <w:semiHidden/>
-    <w:rsid w:val="007C5F84"/>
+    <w:rsid w:val="005B760A"/>
     <w:rPr>
       <w:rFonts w:ascii="Aptos" w:eastAsiaTheme="majorEastAsia" w:hAnsi="Aptos" w:cstheme="majorBidi"/>
       <w:b/>
@@ -3642,7 +3612,7 @@
     <w:link w:val="Heading4"/>
     <w:uiPriority w:val="9"/>
     <w:semiHidden/>
-    <w:rsid w:val="007C5F84"/>
+    <w:rsid w:val="005B760A"/>
     <w:rPr>
       <w:rFonts w:eastAsiaTheme="majorEastAsia" w:cstheme="majorBidi"/>
       <w:i/>
@@ -3656,7 +3626,7 @@
     <w:link w:val="Heading5"/>
     <w:uiPriority w:val="9"/>
     <w:semiHidden/>
-    <w:rsid w:val="007C5F84"/>
+    <w:rsid w:val="005B760A"/>
     <w:rPr>
       <w:rFonts w:eastAsiaTheme="majorEastAsia" w:cstheme="majorBidi"/>
       <w:color w:val="0F4761" w:themeColor="accent1" w:themeShade="BF"/>
@@ -3668,7 +3638,7 @@
     <w:link w:val="Heading6"/>
     <w:uiPriority w:val="9"/>
     <w:semiHidden/>
-    <w:rsid w:val="007C5F84"/>
+    <w:rsid w:val="005B760A"/>
     <w:rPr>
       <w:rFonts w:eastAsiaTheme="majorEastAsia" w:cstheme="majorBidi"/>
       <w:i/>
@@ -3682,7 +3652,7 @@
     <w:link w:val="Heading7"/>
     <w:uiPriority w:val="9"/>
     <w:semiHidden/>
-    <w:rsid w:val="007C5F84"/>
+    <w:rsid w:val="005B760A"/>
     <w:rPr>
       <w:rFonts w:eastAsiaTheme="majorEastAsia" w:cstheme="majorBidi"/>
       <w:color w:val="595959" w:themeColor="text1" w:themeTint="A6"/>
@@ -3694,7 +3664,7 @@
     <w:link w:val="Heading8"/>
     <w:uiPriority w:val="9"/>
     <w:semiHidden/>
-    <w:rsid w:val="007C5F84"/>
+    <w:rsid w:val="005B760A"/>
     <w:rPr>
       <w:rFonts w:eastAsiaTheme="majorEastAsia" w:cstheme="majorBidi"/>
       <w:i/>
@@ -3708,7 +3678,7 @@
     <w:link w:val="Heading9"/>
     <w:uiPriority w:val="9"/>
     <w:semiHidden/>
-    <w:rsid w:val="007C5F84"/>
+    <w:rsid w:val="005B760A"/>
     <w:rPr>
       <w:rFonts w:eastAsiaTheme="majorEastAsia" w:cstheme="majorBidi"/>
       <w:color w:val="272727" w:themeColor="text1" w:themeTint="D8"/>
@@ -3721,7 +3691,7 @@
     <w:link w:val="TitleChar"/>
     <w:uiPriority w:val="10"/>
     <w:qFormat/>
-    <w:rsid w:val="007C5F84"/>
+    <w:rsid w:val="005B760A"/>
     <w:pPr>
       <w:spacing w:after="80" w:line="240" w:lineRule="auto"/>
       <w:contextualSpacing/>
@@ -3739,7 +3709,7 @@
     <w:basedOn w:val="DefaultParagraphFont"/>
     <w:link w:val="Title"/>
     <w:uiPriority w:val="10"/>
-    <w:rsid w:val="007C5F84"/>
+    <w:rsid w:val="005B760A"/>
     <w:rPr>
       <w:rFonts w:asciiTheme="majorHAnsi" w:eastAsiaTheme="majorEastAsia" w:hAnsiTheme="majorHAnsi" w:cstheme="majorBidi"/>
       <w:spacing w:val="-10"/>
@@ -3755,7 +3725,7 @@
     <w:link w:val="SubtitleChar"/>
     <w:uiPriority w:val="11"/>
     <w:qFormat/>
-    <w:rsid w:val="007C5F84"/>
+    <w:rsid w:val="005B760A"/>
     <w:pPr>
       <w:numPr>
         <w:ilvl w:val="1"/>
@@ -3774,7 +3744,7 @@
     <w:basedOn w:val="DefaultParagraphFont"/>
     <w:link w:val="Subtitle"/>
     <w:uiPriority w:val="11"/>
-    <w:rsid w:val="007C5F84"/>
+    <w:rsid w:val="005B760A"/>
     <w:rPr>
       <w:rFonts w:eastAsiaTheme="majorEastAsia" w:cstheme="majorBidi"/>
       <w:color w:val="595959" w:themeColor="text1" w:themeTint="A6"/>
@@ -3790,7 +3760,7 @@
     <w:link w:val="QuoteChar"/>
     <w:uiPriority w:val="29"/>
     <w:qFormat/>
-    <w:rsid w:val="007C5F84"/>
+    <w:rsid w:val="005B760A"/>
     <w:pPr>
       <w:spacing w:before="160"/>
       <w:jc w:val="center"/>
@@ -3806,7 +3776,7 @@
     <w:basedOn w:val="DefaultParagraphFont"/>
     <w:link w:val="Quote"/>
     <w:uiPriority w:val="29"/>
-    <w:rsid w:val="007C5F84"/>
+    <w:rsid w:val="005B760A"/>
     <w:rPr>
       <w:i/>
       <w:iCs/>
@@ -3818,7 +3788,7 @@
     <w:basedOn w:val="Normal"/>
     <w:uiPriority w:val="34"/>
     <w:qFormat/>
-    <w:rsid w:val="007C5F84"/>
+    <w:rsid w:val="005B760A"/>
     <w:pPr>
       <w:ind w:left="720"/>
       <w:contextualSpacing/>
@@ -3829,7 +3799,7 @@
     <w:basedOn w:val="DefaultParagraphFont"/>
     <w:uiPriority w:val="21"/>
     <w:qFormat/>
-    <w:rsid w:val="007C5F84"/>
+    <w:rsid w:val="005B760A"/>
     <w:rPr>
       <w:i/>
       <w:iCs/>
@@ -3843,7 +3813,7 @@
     <w:link w:val="IntenseQuoteChar"/>
     <w:uiPriority w:val="30"/>
     <w:qFormat/>
-    <w:rsid w:val="007C5F84"/>
+    <w:rsid w:val="005B760A"/>
     <w:pPr>
       <w:pBdr>
         <w:top w:val="single" w:sz="4" w:space="10" w:color="0F4761" w:themeColor="accent1" w:themeShade="BF"/>
@@ -3864,7 +3834,7 @@
     <w:basedOn w:val="DefaultParagraphFont"/>
     <w:link w:val="IntenseQuote"/>
     <w:uiPriority w:val="30"/>
-    <w:rsid w:val="007C5F84"/>
+    <w:rsid w:val="005B760A"/>
     <w:rPr>
       <w:i/>
       <w:iCs/>
@@ -3876,7 +3846,7 @@
     <w:basedOn w:val="DefaultParagraphFont"/>
     <w:uiPriority w:val="32"/>
     <w:qFormat/>
-    <w:rsid w:val="007C5F84"/>
+    <w:rsid w:val="005B760A"/>
     <w:rPr>
       <w:b/>
       <w:bCs/>
@@ -3892,7 +3862,7 @@
     <w:autoRedefine/>
     <w:uiPriority w:val="39"/>
     <w:unhideWhenUsed/>
-    <w:rsid w:val="007C5F84"/>
+    <w:rsid w:val="005B760A"/>
     <w:pPr>
       <w:spacing w:after="100"/>
     </w:pPr>
@@ -3904,7 +3874,7 @@
     <w:autoRedefine/>
     <w:uiPriority w:val="39"/>
     <w:unhideWhenUsed/>
-    <w:rsid w:val="007C5F84"/>
+    <w:rsid w:val="005B760A"/>
     <w:pPr>
       <w:spacing w:after="100"/>
       <w:ind w:left="220"/>
@@ -3916,7 +3886,7 @@
     <w:link w:val="HeaderChar"/>
     <w:uiPriority w:val="99"/>
     <w:unhideWhenUsed/>
-    <w:rsid w:val="007C5F84"/>
+    <w:rsid w:val="005B760A"/>
     <w:pPr>
       <w:tabs>
         <w:tab w:val="center" w:pos="4513"/>
@@ -3930,7 +3900,7 @@
     <w:basedOn w:val="DefaultParagraphFont"/>
     <w:link w:val="Header"/>
     <w:uiPriority w:val="99"/>
-    <w:rsid w:val="007C5F84"/>
+    <w:rsid w:val="005B760A"/>
     <w:rPr>
       <w:rFonts w:ascii="Aptos" w:hAnsi="Aptos"/>
       <w:sz w:val="22"/>
@@ -3942,7 +3912,7 @@
     <w:link w:val="FooterChar"/>
     <w:uiPriority w:val="99"/>
     <w:unhideWhenUsed/>
-    <w:rsid w:val="007C5F84"/>
+    <w:rsid w:val="005B760A"/>
     <w:pPr>
       <w:tabs>
         <w:tab w:val="center" w:pos="4513"/>
@@ -3956,7 +3926,7 @@
     <w:basedOn w:val="DefaultParagraphFont"/>
     <w:link w:val="Footer"/>
     <w:uiPriority w:val="99"/>
-    <w:rsid w:val="007C5F84"/>
+    <w:rsid w:val="005B760A"/>
     <w:rPr>
       <w:rFonts w:ascii="Aptos" w:hAnsi="Aptos"/>
       <w:sz w:val="22"/>
@@ -3968,7 +3938,7 @@
     <w:uiPriority w:val="99"/>
     <w:semiHidden/>
     <w:unhideWhenUsed/>
-    <w:rsid w:val="007C5F84"/>
+    <w:rsid w:val="005B760A"/>
   </w:style>
 </w:styles>
 </file>

</xml_diff>

<commit_message>
Remove group from cover page and README student info
</commit_message>
<xml_diff>
--- a/docs/Website-Project-Proposal.docx
+++ b/docs/Website-Project-Proposal.docx
@@ -101,19 +101,6 @@
         <w:rPr>
           <w:sz w:val="24"/>
         </w:rPr>
-        <w:t>Group: Group 3</w:t>
-      </w:r>
-    </w:p>
-    <w:p>
-      <w:pPr>
-        <w:rPr>
-          <w:sz w:val="24"/>
-        </w:rPr>
-      </w:pPr>
-      <w:r>
-        <w:rPr>
-          <w:sz w:val="24"/>
-        </w:rPr>
         <w:t>Date: 1 September 2026</w:t>
       </w:r>
     </w:p>
@@ -182,7 +169,7 @@
         <w:rPr>
           <w:noProof/>
         </w:rPr>
-        <w:instrText xml:space="preserve"> PAGEREF _Toc239193375 \h </w:instrText>
+        <w:instrText xml:space="preserve"> PAGEREF _Toc239197419 \h </w:instrText>
       </w:r>
       <w:r>
         <w:rPr>
@@ -240,7 +227,7 @@
         <w:rPr>
           <w:noProof/>
         </w:rPr>
-        <w:instrText xml:space="preserve"> PAGEREF _Toc239193376 \h </w:instrText>
+        <w:instrText xml:space="preserve"> PAGEREF _Toc239197420 \h </w:instrText>
       </w:r>
       <w:r>
         <w:rPr>
@@ -298,7 +285,7 @@
         <w:rPr>
           <w:noProof/>
         </w:rPr>
-        <w:instrText xml:space="preserve"> PAGEREF _Toc239193377 \h </w:instrText>
+        <w:instrText xml:space="preserve"> PAGEREF _Toc239197421 \h </w:instrText>
       </w:r>
       <w:r>
         <w:rPr>
@@ -356,7 +343,7 @@
         <w:rPr>
           <w:noProof/>
         </w:rPr>
-        <w:instrText xml:space="preserve"> PAGEREF _Toc239193378 \h </w:instrText>
+        <w:instrText xml:space="preserve"> PAGEREF _Toc239197422 \h </w:instrText>
       </w:r>
       <w:r>
         <w:rPr>
@@ -414,7 +401,7 @@
         <w:rPr>
           <w:noProof/>
         </w:rPr>
-        <w:instrText xml:space="preserve"> PAGEREF _Toc239193379 \h </w:instrText>
+        <w:instrText xml:space="preserve"> PAGEREF _Toc239197423 \h </w:instrText>
       </w:r>
       <w:r>
         <w:rPr>
@@ -472,7 +459,7 @@
         <w:rPr>
           <w:noProof/>
         </w:rPr>
-        <w:instrText xml:space="preserve"> PAGEREF _Toc239193380 \h </w:instrText>
+        <w:instrText xml:space="preserve"> PAGEREF _Toc239197424 \h </w:instrText>
       </w:r>
       <w:r>
         <w:rPr>
@@ -530,7 +517,7 @@
         <w:rPr>
           <w:noProof/>
         </w:rPr>
-        <w:instrText xml:space="preserve"> PAGEREF _Toc239193381 \h </w:instrText>
+        <w:instrText xml:space="preserve"> PAGEREF _Toc239197425 \h </w:instrText>
       </w:r>
       <w:r>
         <w:rPr>
@@ -588,7 +575,7 @@
         <w:rPr>
           <w:noProof/>
         </w:rPr>
-        <w:instrText xml:space="preserve"> PAGEREF _Toc239193382 \h </w:instrText>
+        <w:instrText xml:space="preserve"> PAGEREF _Toc239197426 \h </w:instrText>
       </w:r>
       <w:r>
         <w:rPr>
@@ -646,7 +633,7 @@
         <w:rPr>
           <w:noProof/>
         </w:rPr>
-        <w:instrText xml:space="preserve"> PAGEREF _Toc239193383 \h </w:instrText>
+        <w:instrText xml:space="preserve"> PAGEREF _Toc239197427 \h </w:instrText>
       </w:r>
       <w:r>
         <w:rPr>
@@ -704,7 +691,7 @@
         <w:rPr>
           <w:noProof/>
         </w:rPr>
-        <w:instrText xml:space="preserve"> PAGEREF _Toc239193384 \h </w:instrText>
+        <w:instrText xml:space="preserve"> PAGEREF _Toc239197428 \h </w:instrText>
       </w:r>
       <w:r>
         <w:rPr>
@@ -762,7 +749,7 @@
         <w:rPr>
           <w:noProof/>
         </w:rPr>
-        <w:instrText xml:space="preserve"> PAGEREF _Toc239193385 \h </w:instrText>
+        <w:instrText xml:space="preserve"> PAGEREF _Toc239197429 \h </w:instrText>
       </w:r>
       <w:r>
         <w:rPr>
@@ -820,7 +807,7 @@
         <w:rPr>
           <w:noProof/>
         </w:rPr>
-        <w:instrText xml:space="preserve"> PAGEREF _Toc239193386 \h </w:instrText>
+        <w:instrText xml:space="preserve"> PAGEREF _Toc239197430 \h </w:instrText>
       </w:r>
       <w:r>
         <w:rPr>
@@ -878,7 +865,7 @@
         <w:rPr>
           <w:noProof/>
         </w:rPr>
-        <w:instrText xml:space="preserve"> PAGEREF _Toc239193387 \h </w:instrText>
+        <w:instrText xml:space="preserve"> PAGEREF _Toc239197431 \h </w:instrText>
       </w:r>
       <w:r>
         <w:rPr>
@@ -936,7 +923,7 @@
         <w:rPr>
           <w:noProof/>
         </w:rPr>
-        <w:instrText xml:space="preserve"> PAGEREF _Toc239193388 \h </w:instrText>
+        <w:instrText xml:space="preserve"> PAGEREF _Toc239197432 \h </w:instrText>
       </w:r>
       <w:r>
         <w:rPr>
@@ -994,7 +981,7 @@
         <w:rPr>
           <w:noProof/>
         </w:rPr>
-        <w:instrText xml:space="preserve"> PAGEREF _Toc239193389 \h </w:instrText>
+        <w:instrText xml:space="preserve"> PAGEREF _Toc239197433 \h </w:instrText>
       </w:r>
       <w:r>
         <w:rPr>
@@ -1052,7 +1039,7 @@
         <w:rPr>
           <w:noProof/>
         </w:rPr>
-        <w:instrText xml:space="preserve"> PAGEREF _Toc239193390 \h </w:instrText>
+        <w:instrText xml:space="preserve"> PAGEREF _Toc239197434 \h </w:instrText>
       </w:r>
       <w:r>
         <w:rPr>
@@ -1110,7 +1097,7 @@
         <w:rPr>
           <w:noProof/>
         </w:rPr>
-        <w:instrText xml:space="preserve"> PAGEREF _Toc239193391 \h </w:instrText>
+        <w:instrText xml:space="preserve"> PAGEREF _Toc239197435 \h </w:instrText>
       </w:r>
       <w:r>
         <w:rPr>
@@ -1168,7 +1155,7 @@
         <w:rPr>
           <w:noProof/>
         </w:rPr>
-        <w:instrText xml:space="preserve"> PAGEREF _Toc239193392 \h </w:instrText>
+        <w:instrText xml:space="preserve"> PAGEREF _Toc239197436 \h </w:instrText>
       </w:r>
       <w:r>
         <w:rPr>
@@ -1226,7 +1213,7 @@
         <w:rPr>
           <w:noProof/>
         </w:rPr>
-        <w:instrText xml:space="preserve"> PAGEREF _Toc239193393 \h </w:instrText>
+        <w:instrText xml:space="preserve"> PAGEREF _Toc239197437 \h </w:instrText>
       </w:r>
       <w:r>
         <w:rPr>
@@ -1284,7 +1271,7 @@
         <w:rPr>
           <w:noProof/>
         </w:rPr>
-        <w:instrText xml:space="preserve"> PAGEREF _Toc239193394 \h </w:instrText>
+        <w:instrText xml:space="preserve"> PAGEREF _Toc239197438 \h </w:instrText>
       </w:r>
       <w:r>
         <w:rPr>
@@ -1327,7 +1314,7 @@
       <w:pPr>
         <w:pStyle w:val="Heading1"/>
       </w:pPr>
-      <w:bookmarkStart w:id="0" w:name="_Toc239193375"/>
+      <w:bookmarkStart w:id="0" w:name="_Toc239197419"/>
       <w:r>
         <w:lastRenderedPageBreak/>
         <w:t>Proposal 1: VoltStream Plumbing and Electrical (Pty) Ltd</w:t>
@@ -1338,7 +1325,7 @@
       <w:pPr>
         <w:pStyle w:val="Heading2"/>
       </w:pPr>
-      <w:bookmarkStart w:id="1" w:name="_Toc239193376"/>
+      <w:bookmarkStart w:id="1" w:name="_Toc239197420"/>
       <w:r>
         <w:t>1. Organisation Overview</w:t>
       </w:r>
@@ -1373,7 +1360,7 @@
       <w:pPr>
         <w:pStyle w:val="Heading2"/>
       </w:pPr>
-      <w:bookmarkStart w:id="2" w:name="_Toc239193377"/>
+      <w:bookmarkStart w:id="2" w:name="_Toc239197421"/>
       <w:r>
         <w:t>2. Website Goals and Objectives</w:t>
       </w:r>
@@ -1448,7 +1435,7 @@
       <w:pPr>
         <w:pStyle w:val="Heading2"/>
       </w:pPr>
-      <w:bookmarkStart w:id="3" w:name="_Toc239193378"/>
+      <w:bookmarkStart w:id="3" w:name="_Toc239197422"/>
       <w:r>
         <w:t>3. Current Website Analysis</w:t>
       </w:r>
@@ -1463,7 +1450,7 @@
       <w:pPr>
         <w:pStyle w:val="Heading2"/>
       </w:pPr>
-      <w:bookmarkStart w:id="4" w:name="_Toc239193379"/>
+      <w:bookmarkStart w:id="4" w:name="_Toc239197423"/>
       <w:r>
         <w:t>4. Proposed Website Features and Functionality</w:t>
       </w:r>
@@ -1544,7 +1531,7 @@
       <w:pPr>
         <w:pStyle w:val="Heading2"/>
       </w:pPr>
-      <w:bookmarkStart w:id="5" w:name="_Toc239193380"/>
+      <w:bookmarkStart w:id="5" w:name="_Toc239197424"/>
       <w:r>
         <w:t>5. Design and User Experience</w:t>
       </w:r>
@@ -1567,16 +1554,16 @@
         </w:rPr>
         <w:lastRenderedPageBreak/>
         <w:drawing>
-          <wp:inline distT="0" distB="0" distL="0" distR="0" wp14:anchorId="0BA96392" wp14:editId="57650244">
+          <wp:inline distT="0" distB="0" distL="0" distR="0" wp14:anchorId="06B53C05" wp14:editId="48AFF6BD">
             <wp:extent cx="5731510" cy="6850380"/>
             <wp:effectExtent l="0" t="0" r="2540" b="7620"/>
-            <wp:docPr id="624615788" name="Picture 1"/>
+            <wp:docPr id="1861728542" name="Picture 1"/>
             <wp:cNvGraphicFramePr/>
             <a:graphic xmlns:a="http://schemas.openxmlformats.org/drawingml/2006/main">
               <a:graphicData uri="http://schemas.openxmlformats.org/drawingml/2006/picture">
                 <pic:pic xmlns:pic="http://schemas.openxmlformats.org/drawingml/2006/picture">
                   <pic:nvPicPr>
-                    <pic:cNvPr id="624615788" name=""/>
+                    <pic:cNvPr id="1861728542" name=""/>
                     <pic:cNvPicPr/>
                   </pic:nvPicPr>
                   <pic:blipFill>
@@ -1618,7 +1605,7 @@
       <w:pPr>
         <w:pStyle w:val="Heading2"/>
       </w:pPr>
-      <w:bookmarkStart w:id="6" w:name="_Toc239193381"/>
+      <w:bookmarkStart w:id="6" w:name="_Toc239197425"/>
       <w:r>
         <w:t>6. Technical Requirements</w:t>
       </w:r>
@@ -1676,7 +1663,7 @@
       <w:pPr>
         <w:pStyle w:val="Heading2"/>
       </w:pPr>
-      <w:bookmarkStart w:id="7" w:name="_Toc239193382"/>
+      <w:bookmarkStart w:id="7" w:name="_Toc239197426"/>
       <w:r>
         <w:lastRenderedPageBreak/>
         <w:t>7. Timeline and Milestones</w:t>
@@ -1747,7 +1734,7 @@
       <w:pPr>
         <w:pStyle w:val="Heading2"/>
       </w:pPr>
-      <w:bookmarkStart w:id="8" w:name="_Toc239193383"/>
+      <w:bookmarkStart w:id="8" w:name="_Toc239197427"/>
       <w:r>
         <w:t>8. Budget</w:t>
       </w:r>
@@ -1834,7 +1821,7 @@
       <w:pPr>
         <w:pStyle w:val="Heading2"/>
       </w:pPr>
-      <w:bookmarkStart w:id="9" w:name="_Toc239193384"/>
+      <w:bookmarkStart w:id="9" w:name="_Toc239197428"/>
       <w:r>
         <w:t>9. References</w:t>
       </w:r>
@@ -1900,7 +1887,7 @@
       <w:pPr>
         <w:pStyle w:val="Heading1"/>
       </w:pPr>
-      <w:bookmarkStart w:id="10" w:name="_Toc239193385"/>
+      <w:bookmarkStart w:id="10" w:name="_Toc239197429"/>
       <w:r>
         <w:lastRenderedPageBreak/>
         <w:t>Proposal 2: Paws of Hope Animal Shelter (NPO)</w:t>
@@ -1911,7 +1898,7 @@
       <w:pPr>
         <w:pStyle w:val="Heading2"/>
       </w:pPr>
-      <w:bookmarkStart w:id="11" w:name="_Toc239193386"/>
+      <w:bookmarkStart w:id="11" w:name="_Toc239197430"/>
       <w:r>
         <w:t>1. Organisation Overview</w:t>
       </w:r>
@@ -1946,7 +1933,7 @@
       <w:pPr>
         <w:pStyle w:val="Heading2"/>
       </w:pPr>
-      <w:bookmarkStart w:id="12" w:name="_Toc239193387"/>
+      <w:bookmarkStart w:id="12" w:name="_Toc239197431"/>
       <w:r>
         <w:t>2. Website Goals and Objectives</w:t>
       </w:r>
@@ -2021,7 +2008,7 @@
       <w:pPr>
         <w:pStyle w:val="Heading2"/>
       </w:pPr>
-      <w:bookmarkStart w:id="13" w:name="_Toc239193388"/>
+      <w:bookmarkStart w:id="13" w:name="_Toc239197432"/>
       <w:r>
         <w:t>3. Current Website Analysis</w:t>
       </w:r>
@@ -2036,7 +2023,7 @@
       <w:pPr>
         <w:pStyle w:val="Heading2"/>
       </w:pPr>
-      <w:bookmarkStart w:id="14" w:name="_Toc239193389"/>
+      <w:bookmarkStart w:id="14" w:name="_Toc239197433"/>
       <w:r>
         <w:t>4. Proposed Website Features and Functionality</w:t>
       </w:r>
@@ -2117,7 +2104,7 @@
       <w:pPr>
         <w:pStyle w:val="Heading2"/>
       </w:pPr>
-      <w:bookmarkStart w:id="15" w:name="_Toc239193390"/>
+      <w:bookmarkStart w:id="15" w:name="_Toc239197434"/>
       <w:r>
         <w:t>5. Design and User Experience</w:t>
       </w:r>
@@ -2140,16 +2127,16 @@
         </w:rPr>
         <w:lastRenderedPageBreak/>
         <w:drawing>
-          <wp:inline distT="0" distB="0" distL="0" distR="0" wp14:anchorId="1D317BBA" wp14:editId="329F80A8">
+          <wp:inline distT="0" distB="0" distL="0" distR="0" wp14:anchorId="4DCEB3B1" wp14:editId="49565D33">
             <wp:extent cx="5731510" cy="6850380"/>
             <wp:effectExtent l="0" t="0" r="2540" b="7620"/>
-            <wp:docPr id="1268794818" name="Picture 2"/>
+            <wp:docPr id="1299201199" name="Picture 2"/>
             <wp:cNvGraphicFramePr/>
             <a:graphic xmlns:a="http://schemas.openxmlformats.org/drawingml/2006/main">
               <a:graphicData uri="http://schemas.openxmlformats.org/drawingml/2006/picture">
                 <pic:pic xmlns:pic="http://schemas.openxmlformats.org/drawingml/2006/picture">
                   <pic:nvPicPr>
-                    <pic:cNvPr id="1268794818" name=""/>
+                    <pic:cNvPr id="1299201199" name=""/>
                     <pic:cNvPicPr/>
                   </pic:nvPicPr>
                   <pic:blipFill>
@@ -2191,7 +2178,7 @@
       <w:pPr>
         <w:pStyle w:val="Heading2"/>
       </w:pPr>
-      <w:bookmarkStart w:id="16" w:name="_Toc239193391"/>
+      <w:bookmarkStart w:id="16" w:name="_Toc239197435"/>
       <w:r>
         <w:t>6. Technical Requirements</w:t>
       </w:r>
@@ -2261,7 +2248,7 @@
       <w:pPr>
         <w:pStyle w:val="Heading2"/>
       </w:pPr>
-      <w:bookmarkStart w:id="17" w:name="_Toc239193392"/>
+      <w:bookmarkStart w:id="17" w:name="_Toc239197436"/>
       <w:r>
         <w:lastRenderedPageBreak/>
         <w:t>7. Timeline and Milestones</w:t>
@@ -2332,7 +2319,7 @@
       <w:pPr>
         <w:pStyle w:val="Heading2"/>
       </w:pPr>
-      <w:bookmarkStart w:id="18" w:name="_Toc239193393"/>
+      <w:bookmarkStart w:id="18" w:name="_Toc239197437"/>
       <w:r>
         <w:t>8. Budget</w:t>
       </w:r>
@@ -2419,7 +2406,7 @@
       <w:pPr>
         <w:pStyle w:val="Heading2"/>
       </w:pPr>
-      <w:bookmarkStart w:id="19" w:name="_Toc239193394"/>
+      <w:bookmarkStart w:id="19" w:name="_Toc239197438"/>
       <w:r>
         <w:t>9. References</w:t>
       </w:r>
@@ -2686,7 +2673,7 @@
 <file path=word/numbering.xml><?xml version="1.0" encoding="utf-8"?>
 <w:numbering xmlns:wpc="http://schemas.microsoft.com/office/word/2010/wordprocessingCanvas" xmlns:cx="http://schemas.microsoft.com/office/drawing/2014/chartex" xmlns:cx1="http://schemas.microsoft.com/office/drawing/2015/9/8/chartex" xmlns:cx2="http://schemas.microsoft.com/office/drawing/2015/10/21/chartex" xmlns:cx3="http://schemas.microsoft.com/office/drawing/2016/5/9/chartex" xmlns:cx4="http://schemas.microsoft.com/office/drawing/2016/5/10/chartex" xmlns:cx5="http://schemas.microsoft.com/office/drawing/2016/5/11/chartex" xmlns:cx6="http://schemas.microsoft.com/office/drawing/2016/5/12/chartex" xmlns:cx7="http://schemas.microsoft.com/office/drawing/2016/5/13/chartex" xmlns:cx8="http://schemas.microsoft.com/office/drawing/2016/5/14/chartex" xmlns:mc="http://schemas.openxmlformats.org/markup-compatibility/2006" xmlns:aink="http://schemas.microsoft.com/office/drawing/2016/ink" xmlns:am3d="http://schemas.microsoft.com/office/drawing/2017/model3d" xmlns:o="urn:schemas-microsoft-com:office:office" xmlns:oel="http://schemas.microsoft.com/office/2019/extlst" xmlns:r="http://schemas.openxmlformats.org/officeDocument/2006/relationships" xmlns:m="http://schemas.openxmlformats.org/officeDocument/2006/math" xmlns:v="urn:schemas-microsoft-com:vml" xmlns:wp14="http://schemas.microsoft.com/office/word/2010/wordprocessingDrawing" xmlns:wp="http://schemas.openxmlformats.org/drawingml/2006/wordprocessingDrawing" xmlns:w10="urn:schemas-microsoft-com:office:word" xmlns:w="http://schemas.openxmlformats.org/wordprocessingml/2006/main" xmlns:w14="http://schemas.microsoft.com/office/word/2010/wordml" xmlns:w15="http://schemas.microsoft.com/office/word/2012/wordml" xmlns:w16cex="http://schemas.microsoft.com/office/word/2018/wordml/cex" xmlns:w16cid="http://schemas.microsoft.com/office/word/2016/wordml/cid" xmlns:w16="http://schemas.microsoft.com/office/word/2018/wordml" xmlns:w16du="http://schemas.microsoft.com/office/word/2023/wordml/word16du" xmlns:w16sdtdh="http://schemas.microsoft.com/office/word/2020/wordml/sdtdatahash" xmlns:w16sdtfl="http://schemas.microsoft.com/office/word/2024/wordml/sdtformatlock" xmlns:w16se="http://schemas.microsoft.com/office/word/2015/wordml/symex" xmlns:wpg="http://schemas.microsoft.com/office/word/2010/wordprocessingGroup" xmlns:wpi="http://schemas.microsoft.com/office/word/2010/wordprocessingInk" xmlns:wne="http://schemas.microsoft.com/office/word/2006/wordml" xmlns:wps="http://schemas.microsoft.com/office/word/2010/wordprocessingShape" mc:Ignorable="w14 w15 w16se w16cid w16 w16cex w16sdtdh w16sdtfl w16du wp14">
   <w:abstractNum w:abstractNumId="0" w15:restartNumberingAfterBreak="0">
-    <w:nsid w:val="015252B6"/>
+    <w:nsid w:val="0F4B4FED"/>
     <w:multiLevelType w:val="singleLevel"/>
     <w:tmpl w:val="1C090001"/>
     <w:lvl w:ilvl="0">
@@ -2703,7 +2690,7 @@
     </w:lvl>
   </w:abstractNum>
   <w:abstractNum w:abstractNumId="1" w15:restartNumberingAfterBreak="0">
-    <w:nsid w:val="06BE59FC"/>
+    <w:nsid w:val="134F01C8"/>
     <w:multiLevelType w:val="singleLevel"/>
     <w:tmpl w:val="1C090001"/>
     <w:lvl w:ilvl="0">
@@ -2720,7 +2707,7 @@
     </w:lvl>
   </w:abstractNum>
   <w:abstractNum w:abstractNumId="2" w15:restartNumberingAfterBreak="0">
-    <w:nsid w:val="13C7604C"/>
+    <w:nsid w:val="1D091C65"/>
     <w:multiLevelType w:val="singleLevel"/>
     <w:tmpl w:val="1C090001"/>
     <w:lvl w:ilvl="0">
@@ -2737,7 +2724,7 @@
     </w:lvl>
   </w:abstractNum>
   <w:abstractNum w:abstractNumId="3" w15:restartNumberingAfterBreak="0">
-    <w:nsid w:val="1C5344BE"/>
+    <w:nsid w:val="1DDA737C"/>
     <w:multiLevelType w:val="singleLevel"/>
     <w:tmpl w:val="1C090001"/>
     <w:lvl w:ilvl="0">
@@ -2754,7 +2741,7 @@
     </w:lvl>
   </w:abstractNum>
   <w:abstractNum w:abstractNumId="4" w15:restartNumberingAfterBreak="0">
-    <w:nsid w:val="26FE17E7"/>
+    <w:nsid w:val="232166DF"/>
     <w:multiLevelType w:val="singleLevel"/>
     <w:tmpl w:val="1C090001"/>
     <w:lvl w:ilvl="0">
@@ -2771,7 +2758,7 @@
     </w:lvl>
   </w:abstractNum>
   <w:abstractNum w:abstractNumId="5" w15:restartNumberingAfterBreak="0">
-    <w:nsid w:val="34B668DF"/>
+    <w:nsid w:val="3E6C68C3"/>
     <w:multiLevelType w:val="singleLevel"/>
     <w:tmpl w:val="1C090001"/>
     <w:lvl w:ilvl="0">
@@ -2788,7 +2775,7 @@
     </w:lvl>
   </w:abstractNum>
   <w:abstractNum w:abstractNumId="6" w15:restartNumberingAfterBreak="0">
-    <w:nsid w:val="47FE1D18"/>
+    <w:nsid w:val="42E51780"/>
     <w:multiLevelType w:val="singleLevel"/>
     <w:tmpl w:val="1C090001"/>
     <w:lvl w:ilvl="0">
@@ -2805,7 +2792,7 @@
     </w:lvl>
   </w:abstractNum>
   <w:abstractNum w:abstractNumId="7" w15:restartNumberingAfterBreak="0">
-    <w:nsid w:val="56C7537E"/>
+    <w:nsid w:val="634F0F43"/>
     <w:multiLevelType w:val="singleLevel"/>
     <w:tmpl w:val="1C090001"/>
     <w:lvl w:ilvl="0">
@@ -2822,7 +2809,7 @@
     </w:lvl>
   </w:abstractNum>
   <w:abstractNum w:abstractNumId="8" w15:restartNumberingAfterBreak="0">
-    <w:nsid w:val="65843752"/>
+    <w:nsid w:val="65F52460"/>
     <w:multiLevelType w:val="singleLevel"/>
     <w:tmpl w:val="1C090001"/>
     <w:lvl w:ilvl="0">
@@ -2839,7 +2826,7 @@
     </w:lvl>
   </w:abstractNum>
   <w:abstractNum w:abstractNumId="9" w15:restartNumberingAfterBreak="0">
-    <w:nsid w:val="6C327CA5"/>
+    <w:nsid w:val="6D4C4659"/>
     <w:multiLevelType w:val="singleLevel"/>
     <w:tmpl w:val="1C090001"/>
     <w:lvl w:ilvl="0">
@@ -2856,7 +2843,7 @@
     </w:lvl>
   </w:abstractNum>
   <w:abstractNum w:abstractNumId="10" w15:restartNumberingAfterBreak="0">
-    <w:nsid w:val="739F6B36"/>
+    <w:nsid w:val="76085E9F"/>
     <w:multiLevelType w:val="singleLevel"/>
     <w:tmpl w:val="1C090001"/>
     <w:lvl w:ilvl="0">
@@ -2873,7 +2860,7 @@
     </w:lvl>
   </w:abstractNum>
   <w:abstractNum w:abstractNumId="11" w15:restartNumberingAfterBreak="0">
-    <w:nsid w:val="757E37A8"/>
+    <w:nsid w:val="79726982"/>
     <w:multiLevelType w:val="singleLevel"/>
     <w:tmpl w:val="1C090001"/>
     <w:lvl w:ilvl="0">
@@ -2889,41 +2876,41 @@
       </w:rPr>
     </w:lvl>
   </w:abstractNum>
-  <w:num w:numId="1" w16cid:durableId="1549606032">
+  <w:num w:numId="1" w16cid:durableId="236405142">
+    <w:abstractNumId w:val="7"/>
+  </w:num>
+  <w:num w:numId="2" w16cid:durableId="952398314">
+    <w:abstractNumId w:val="11"/>
+  </w:num>
+  <w:num w:numId="3" w16cid:durableId="1674576013">
+    <w:abstractNumId w:val="6"/>
+  </w:num>
+  <w:num w:numId="4" w16cid:durableId="775366013">
+    <w:abstractNumId w:val="8"/>
+  </w:num>
+  <w:num w:numId="5" w16cid:durableId="775951638">
     <w:abstractNumId w:val="1"/>
   </w:num>
-  <w:num w:numId="2" w16cid:durableId="790127060">
-    <w:abstractNumId w:val="7"/>
+  <w:num w:numId="6" w16cid:durableId="98069487">
+    <w:abstractNumId w:val="0"/>
   </w:num>
-  <w:num w:numId="3" w16cid:durableId="1354844790">
-    <w:abstractNumId w:val="8"/>
+  <w:num w:numId="7" w16cid:durableId="426927006">
+    <w:abstractNumId w:val="9"/>
   </w:num>
-  <w:num w:numId="4" w16cid:durableId="1876261786">
-    <w:abstractNumId w:val="2"/>
+  <w:num w:numId="8" w16cid:durableId="608271122">
+    <w:abstractNumId w:val="4"/>
   </w:num>
-  <w:num w:numId="5" w16cid:durableId="1708986288">
+  <w:num w:numId="9" w16cid:durableId="539709279">
+    <w:abstractNumId w:val="5"/>
+  </w:num>
+  <w:num w:numId="10" w16cid:durableId="1956478870">
     <w:abstractNumId w:val="10"/>
   </w:num>
-  <w:num w:numId="6" w16cid:durableId="1411738073">
-    <w:abstractNumId w:val="11"/>
-  </w:num>
-  <w:num w:numId="7" w16cid:durableId="228731276">
+  <w:num w:numId="11" w16cid:durableId="1744182073">
     <w:abstractNumId w:val="3"/>
   </w:num>
-  <w:num w:numId="8" w16cid:durableId="1057439118">
-    <w:abstractNumId w:val="4"/>
-  </w:num>
-  <w:num w:numId="9" w16cid:durableId="1352879241">
-    <w:abstractNumId w:val="9"/>
-  </w:num>
-  <w:num w:numId="10" w16cid:durableId="1498881254">
-    <w:abstractNumId w:val="6"/>
-  </w:num>
-  <w:num w:numId="11" w16cid:durableId="1212158137">
-    <w:abstractNumId w:val="5"/>
-  </w:num>
-  <w:num w:numId="12" w16cid:durableId="449668903">
-    <w:abstractNumId w:val="0"/>
+  <w:num w:numId="12" w16cid:durableId="2114395605">
+    <w:abstractNumId w:val="2"/>
   </w:num>
 </w:numbering>
 </file>
@@ -3343,7 +3330,7 @@
     <w:link w:val="Heading1Char"/>
     <w:uiPriority w:val="9"/>
     <w:qFormat/>
-    <w:rsid w:val="005B760A"/>
+    <w:rsid w:val="002274FD"/>
     <w:pPr>
       <w:keepNext/>
       <w:keepLines/>
@@ -3366,7 +3353,7 @@
     <w:uiPriority w:val="9"/>
     <w:unhideWhenUsed/>
     <w:qFormat/>
-    <w:rsid w:val="005B760A"/>
+    <w:rsid w:val="002274FD"/>
     <w:pPr>
       <w:keepNext/>
       <w:keepLines/>
@@ -3390,7 +3377,7 @@
     <w:semiHidden/>
     <w:unhideWhenUsed/>
     <w:qFormat/>
-    <w:rsid w:val="005B760A"/>
+    <w:rsid w:val="002274FD"/>
     <w:pPr>
       <w:keepNext/>
       <w:keepLines/>
@@ -3413,7 +3400,7 @@
     <w:semiHidden/>
     <w:unhideWhenUsed/>
     <w:qFormat/>
-    <w:rsid w:val="005B760A"/>
+    <w:rsid w:val="002274FD"/>
     <w:pPr>
       <w:keepNext/>
       <w:keepLines/>
@@ -3436,7 +3423,7 @@
     <w:semiHidden/>
     <w:unhideWhenUsed/>
     <w:qFormat/>
-    <w:rsid w:val="005B760A"/>
+    <w:rsid w:val="002274FD"/>
     <w:pPr>
       <w:keepNext/>
       <w:keepLines/>
@@ -3457,7 +3444,7 @@
     <w:semiHidden/>
     <w:unhideWhenUsed/>
     <w:qFormat/>
-    <w:rsid w:val="005B760A"/>
+    <w:rsid w:val="002274FD"/>
     <w:pPr>
       <w:keepNext/>
       <w:keepLines/>
@@ -3480,7 +3467,7 @@
     <w:semiHidden/>
     <w:unhideWhenUsed/>
     <w:qFormat/>
-    <w:rsid w:val="005B760A"/>
+    <w:rsid w:val="002274FD"/>
     <w:pPr>
       <w:keepNext/>
       <w:keepLines/>
@@ -3501,7 +3488,7 @@
     <w:semiHidden/>
     <w:unhideWhenUsed/>
     <w:qFormat/>
-    <w:rsid w:val="005B760A"/>
+    <w:rsid w:val="002274FD"/>
     <w:pPr>
       <w:keepNext/>
       <w:keepLines/>
@@ -3524,7 +3511,7 @@
     <w:semiHidden/>
     <w:unhideWhenUsed/>
     <w:qFormat/>
-    <w:rsid w:val="005B760A"/>
+    <w:rsid w:val="002274FD"/>
     <w:pPr>
       <w:keepNext/>
       <w:keepLines/>
@@ -3568,7 +3555,7 @@
     <w:basedOn w:val="DefaultParagraphFont"/>
     <w:link w:val="Heading1"/>
     <w:uiPriority w:val="9"/>
-    <w:rsid w:val="005B760A"/>
+    <w:rsid w:val="002274FD"/>
     <w:rPr>
       <w:rFonts w:ascii="Aptos" w:eastAsiaTheme="majorEastAsia" w:hAnsi="Aptos" w:cstheme="majorBidi"/>
       <w:b/>
@@ -3582,7 +3569,7 @@
     <w:basedOn w:val="DefaultParagraphFont"/>
     <w:link w:val="Heading2"/>
     <w:uiPriority w:val="9"/>
-    <w:rsid w:val="005B760A"/>
+    <w:rsid w:val="002274FD"/>
     <w:rPr>
       <w:rFonts w:ascii="Aptos" w:eastAsiaTheme="majorEastAsia" w:hAnsi="Aptos" w:cstheme="majorBidi"/>
       <w:b/>
@@ -3597,7 +3584,7 @@
     <w:link w:val="Heading3"/>
     <w:uiPriority w:val="9"/>
     <w:semiHidden/>
-    <w:rsid w:val="005B760A"/>
+    <w:rsid w:val="002274FD"/>
     <w:rPr>
       <w:rFonts w:ascii="Aptos" w:eastAsiaTheme="majorEastAsia" w:hAnsi="Aptos" w:cstheme="majorBidi"/>
       <w:b/>
@@ -3612,7 +3599,7 @@
     <w:link w:val="Heading4"/>
     <w:uiPriority w:val="9"/>
     <w:semiHidden/>
-    <w:rsid w:val="005B760A"/>
+    <w:rsid w:val="002274FD"/>
     <w:rPr>
       <w:rFonts w:eastAsiaTheme="majorEastAsia" w:cstheme="majorBidi"/>
       <w:i/>
@@ -3626,7 +3613,7 @@
     <w:link w:val="Heading5"/>
     <w:uiPriority w:val="9"/>
     <w:semiHidden/>
-    <w:rsid w:val="005B760A"/>
+    <w:rsid w:val="002274FD"/>
     <w:rPr>
       <w:rFonts w:eastAsiaTheme="majorEastAsia" w:cstheme="majorBidi"/>
       <w:color w:val="0F4761" w:themeColor="accent1" w:themeShade="BF"/>
@@ -3638,7 +3625,7 @@
     <w:link w:val="Heading6"/>
     <w:uiPriority w:val="9"/>
     <w:semiHidden/>
-    <w:rsid w:val="005B760A"/>
+    <w:rsid w:val="002274FD"/>
     <w:rPr>
       <w:rFonts w:eastAsiaTheme="majorEastAsia" w:cstheme="majorBidi"/>
       <w:i/>
@@ -3652,7 +3639,7 @@
     <w:link w:val="Heading7"/>
     <w:uiPriority w:val="9"/>
     <w:semiHidden/>
-    <w:rsid w:val="005B760A"/>
+    <w:rsid w:val="002274FD"/>
     <w:rPr>
       <w:rFonts w:eastAsiaTheme="majorEastAsia" w:cstheme="majorBidi"/>
       <w:color w:val="595959" w:themeColor="text1" w:themeTint="A6"/>
@@ -3664,7 +3651,7 @@
     <w:link w:val="Heading8"/>
     <w:uiPriority w:val="9"/>
     <w:semiHidden/>
-    <w:rsid w:val="005B760A"/>
+    <w:rsid w:val="002274FD"/>
     <w:rPr>
       <w:rFonts w:eastAsiaTheme="majorEastAsia" w:cstheme="majorBidi"/>
       <w:i/>
@@ -3678,7 +3665,7 @@
     <w:link w:val="Heading9"/>
     <w:uiPriority w:val="9"/>
     <w:semiHidden/>
-    <w:rsid w:val="005B760A"/>
+    <w:rsid w:val="002274FD"/>
     <w:rPr>
       <w:rFonts w:eastAsiaTheme="majorEastAsia" w:cstheme="majorBidi"/>
       <w:color w:val="272727" w:themeColor="text1" w:themeTint="D8"/>
@@ -3691,7 +3678,7 @@
     <w:link w:val="TitleChar"/>
     <w:uiPriority w:val="10"/>
     <w:qFormat/>
-    <w:rsid w:val="005B760A"/>
+    <w:rsid w:val="002274FD"/>
     <w:pPr>
       <w:spacing w:after="80" w:line="240" w:lineRule="auto"/>
       <w:contextualSpacing/>
@@ -3709,7 +3696,7 @@
     <w:basedOn w:val="DefaultParagraphFont"/>
     <w:link w:val="Title"/>
     <w:uiPriority w:val="10"/>
-    <w:rsid w:val="005B760A"/>
+    <w:rsid w:val="002274FD"/>
     <w:rPr>
       <w:rFonts w:asciiTheme="majorHAnsi" w:eastAsiaTheme="majorEastAsia" w:hAnsiTheme="majorHAnsi" w:cstheme="majorBidi"/>
       <w:spacing w:val="-10"/>
@@ -3725,7 +3712,7 @@
     <w:link w:val="SubtitleChar"/>
     <w:uiPriority w:val="11"/>
     <w:qFormat/>
-    <w:rsid w:val="005B760A"/>
+    <w:rsid w:val="002274FD"/>
     <w:pPr>
       <w:numPr>
         <w:ilvl w:val="1"/>
@@ -3744,7 +3731,7 @@
     <w:basedOn w:val="DefaultParagraphFont"/>
     <w:link w:val="Subtitle"/>
     <w:uiPriority w:val="11"/>
-    <w:rsid w:val="005B760A"/>
+    <w:rsid w:val="002274FD"/>
     <w:rPr>
       <w:rFonts w:eastAsiaTheme="majorEastAsia" w:cstheme="majorBidi"/>
       <w:color w:val="595959" w:themeColor="text1" w:themeTint="A6"/>
@@ -3760,7 +3747,7 @@
     <w:link w:val="QuoteChar"/>
     <w:uiPriority w:val="29"/>
     <w:qFormat/>
-    <w:rsid w:val="005B760A"/>
+    <w:rsid w:val="002274FD"/>
     <w:pPr>
       <w:spacing w:before="160"/>
       <w:jc w:val="center"/>
@@ -3776,7 +3763,7 @@
     <w:basedOn w:val="DefaultParagraphFont"/>
     <w:link w:val="Quote"/>
     <w:uiPriority w:val="29"/>
-    <w:rsid w:val="005B760A"/>
+    <w:rsid w:val="002274FD"/>
     <w:rPr>
       <w:i/>
       <w:iCs/>
@@ -3788,7 +3775,7 @@
     <w:basedOn w:val="Normal"/>
     <w:uiPriority w:val="34"/>
     <w:qFormat/>
-    <w:rsid w:val="005B760A"/>
+    <w:rsid w:val="002274FD"/>
     <w:pPr>
       <w:ind w:left="720"/>
       <w:contextualSpacing/>
@@ -3799,7 +3786,7 @@
     <w:basedOn w:val="DefaultParagraphFont"/>
     <w:uiPriority w:val="21"/>
     <w:qFormat/>
-    <w:rsid w:val="005B760A"/>
+    <w:rsid w:val="002274FD"/>
     <w:rPr>
       <w:i/>
       <w:iCs/>
@@ -3813,7 +3800,7 @@
     <w:link w:val="IntenseQuoteChar"/>
     <w:uiPriority w:val="30"/>
     <w:qFormat/>
-    <w:rsid w:val="005B760A"/>
+    <w:rsid w:val="002274FD"/>
     <w:pPr>
       <w:pBdr>
         <w:top w:val="single" w:sz="4" w:space="10" w:color="0F4761" w:themeColor="accent1" w:themeShade="BF"/>
@@ -3834,7 +3821,7 @@
     <w:basedOn w:val="DefaultParagraphFont"/>
     <w:link w:val="IntenseQuote"/>
     <w:uiPriority w:val="30"/>
-    <w:rsid w:val="005B760A"/>
+    <w:rsid w:val="002274FD"/>
     <w:rPr>
       <w:i/>
       <w:iCs/>
@@ -3846,7 +3833,7 @@
     <w:basedOn w:val="DefaultParagraphFont"/>
     <w:uiPriority w:val="32"/>
     <w:qFormat/>
-    <w:rsid w:val="005B760A"/>
+    <w:rsid w:val="002274FD"/>
     <w:rPr>
       <w:b/>
       <w:bCs/>
@@ -3862,7 +3849,7 @@
     <w:autoRedefine/>
     <w:uiPriority w:val="39"/>
     <w:unhideWhenUsed/>
-    <w:rsid w:val="005B760A"/>
+    <w:rsid w:val="002274FD"/>
     <w:pPr>
       <w:spacing w:after="100"/>
     </w:pPr>
@@ -3874,7 +3861,7 @@
     <w:autoRedefine/>
     <w:uiPriority w:val="39"/>
     <w:unhideWhenUsed/>
-    <w:rsid w:val="005B760A"/>
+    <w:rsid w:val="002274FD"/>
     <w:pPr>
       <w:spacing w:after="100"/>
       <w:ind w:left="220"/>
@@ -3886,7 +3873,7 @@
     <w:link w:val="HeaderChar"/>
     <w:uiPriority w:val="99"/>
     <w:unhideWhenUsed/>
-    <w:rsid w:val="005B760A"/>
+    <w:rsid w:val="002274FD"/>
     <w:pPr>
       <w:tabs>
         <w:tab w:val="center" w:pos="4513"/>
@@ -3900,7 +3887,7 @@
     <w:basedOn w:val="DefaultParagraphFont"/>
     <w:link w:val="Header"/>
     <w:uiPriority w:val="99"/>
-    <w:rsid w:val="005B760A"/>
+    <w:rsid w:val="002274FD"/>
     <w:rPr>
       <w:rFonts w:ascii="Aptos" w:hAnsi="Aptos"/>
       <w:sz w:val="22"/>
@@ -3912,7 +3899,7 @@
     <w:link w:val="FooterChar"/>
     <w:uiPriority w:val="99"/>
     <w:unhideWhenUsed/>
-    <w:rsid w:val="005B760A"/>
+    <w:rsid w:val="002274FD"/>
     <w:pPr>
       <w:tabs>
         <w:tab w:val="center" w:pos="4513"/>
@@ -3926,7 +3913,7 @@
     <w:basedOn w:val="DefaultParagraphFont"/>
     <w:link w:val="Footer"/>
     <w:uiPriority w:val="99"/>
-    <w:rsid w:val="005B760A"/>
+    <w:rsid w:val="002274FD"/>
     <w:rPr>
       <w:rFonts w:ascii="Aptos" w:hAnsi="Aptos"/>
       <w:sz w:val="22"/>
@@ -3938,7 +3925,7 @@
     <w:uiPriority w:val="99"/>
     <w:semiHidden/>
     <w:unhideWhenUsed/>
-    <w:rsid w:val="005B760A"/>
+    <w:rsid w:val="002274FD"/>
   </w:style>
 </w:styles>
 </file>

</xml_diff>

<commit_message>
Add GitHub repository link and note to the proposal cover page
</commit_message>
<xml_diff>
--- a/docs/Website-Project-Proposal.docx
+++ b/docs/Website-Project-Proposal.docx
@@ -106,6 +106,39 @@
     </w:p>
     <w:p>
       <w:pPr>
+        <w:rPr>
+          <w:sz w:val="24"/>
+        </w:rPr>
+      </w:pPr>
+    </w:p>
+    <w:p>
+      <w:pPr>
+        <w:rPr>
+          <w:sz w:val="24"/>
+        </w:rPr>
+      </w:pPr>
+      <w:r>
+        <w:rPr>
+          <w:sz w:val="24"/>
+        </w:rPr>
+        <w:t>GitHub repository: https://github.com/basimakhtar/WEDE5020-PoE</w:t>
+      </w:r>
+    </w:p>
+    <w:p>
+      <w:pPr>
+        <w:rPr>
+          <w:sz w:val="24"/>
+        </w:rPr>
+      </w:pPr>
+      <w:r>
+        <w:rPr>
+          <w:sz w:val="24"/>
+        </w:rPr>
+        <w:t>Note: this repository is on a personal GitHub account because the school's repository invitation link had expired and could not be used.</w:t>
+      </w:r>
+    </w:p>
+    <w:p>
+      <w:pPr>
         <w:spacing w:line="278" w:lineRule="auto"/>
         <w:rPr>
           <w:sz w:val="24"/>
@@ -169,7 +202,7 @@
         <w:rPr>
           <w:noProof/>
         </w:rPr>
-        <w:instrText xml:space="preserve"> PAGEREF _Toc239197419 \h </w:instrText>
+        <w:instrText xml:space="preserve"> PAGEREF _Toc239198890 \h </w:instrText>
       </w:r>
       <w:r>
         <w:rPr>
@@ -227,7 +260,7 @@
         <w:rPr>
           <w:noProof/>
         </w:rPr>
-        <w:instrText xml:space="preserve"> PAGEREF _Toc239197420 \h </w:instrText>
+        <w:instrText xml:space="preserve"> PAGEREF _Toc239198891 \h </w:instrText>
       </w:r>
       <w:r>
         <w:rPr>
@@ -285,7 +318,7 @@
         <w:rPr>
           <w:noProof/>
         </w:rPr>
-        <w:instrText xml:space="preserve"> PAGEREF _Toc239197421 \h </w:instrText>
+        <w:instrText xml:space="preserve"> PAGEREF _Toc239198892 \h </w:instrText>
       </w:r>
       <w:r>
         <w:rPr>
@@ -343,7 +376,7 @@
         <w:rPr>
           <w:noProof/>
         </w:rPr>
-        <w:instrText xml:space="preserve"> PAGEREF _Toc239197422 \h </w:instrText>
+        <w:instrText xml:space="preserve"> PAGEREF _Toc239198893 \h </w:instrText>
       </w:r>
       <w:r>
         <w:rPr>
@@ -401,7 +434,7 @@
         <w:rPr>
           <w:noProof/>
         </w:rPr>
-        <w:instrText xml:space="preserve"> PAGEREF _Toc239197423 \h </w:instrText>
+        <w:instrText xml:space="preserve"> PAGEREF _Toc239198894 \h </w:instrText>
       </w:r>
       <w:r>
         <w:rPr>
@@ -459,7 +492,7 @@
         <w:rPr>
           <w:noProof/>
         </w:rPr>
-        <w:instrText xml:space="preserve"> PAGEREF _Toc239197424 \h </w:instrText>
+        <w:instrText xml:space="preserve"> PAGEREF _Toc239198895 \h </w:instrText>
       </w:r>
       <w:r>
         <w:rPr>
@@ -517,7 +550,7 @@
         <w:rPr>
           <w:noProof/>
         </w:rPr>
-        <w:instrText xml:space="preserve"> PAGEREF _Toc239197425 \h </w:instrText>
+        <w:instrText xml:space="preserve"> PAGEREF _Toc239198896 \h </w:instrText>
       </w:r>
       <w:r>
         <w:rPr>
@@ -575,7 +608,7 @@
         <w:rPr>
           <w:noProof/>
         </w:rPr>
-        <w:instrText xml:space="preserve"> PAGEREF _Toc239197426 \h </w:instrText>
+        <w:instrText xml:space="preserve"> PAGEREF _Toc239198897 \h </w:instrText>
       </w:r>
       <w:r>
         <w:rPr>
@@ -633,7 +666,7 @@
         <w:rPr>
           <w:noProof/>
         </w:rPr>
-        <w:instrText xml:space="preserve"> PAGEREF _Toc239197427 \h </w:instrText>
+        <w:instrText xml:space="preserve"> PAGEREF _Toc239198898 \h </w:instrText>
       </w:r>
       <w:r>
         <w:rPr>
@@ -691,7 +724,7 @@
         <w:rPr>
           <w:noProof/>
         </w:rPr>
-        <w:instrText xml:space="preserve"> PAGEREF _Toc239197428 \h </w:instrText>
+        <w:instrText xml:space="preserve"> PAGEREF _Toc239198899 \h </w:instrText>
       </w:r>
       <w:r>
         <w:rPr>
@@ -749,7 +782,7 @@
         <w:rPr>
           <w:noProof/>
         </w:rPr>
-        <w:instrText xml:space="preserve"> PAGEREF _Toc239197429 \h </w:instrText>
+        <w:instrText xml:space="preserve"> PAGEREF _Toc239198900 \h </w:instrText>
       </w:r>
       <w:r>
         <w:rPr>
@@ -807,7 +840,7 @@
         <w:rPr>
           <w:noProof/>
         </w:rPr>
-        <w:instrText xml:space="preserve"> PAGEREF _Toc239197430 \h </w:instrText>
+        <w:instrText xml:space="preserve"> PAGEREF _Toc239198901 \h </w:instrText>
       </w:r>
       <w:r>
         <w:rPr>
@@ -865,7 +898,7 @@
         <w:rPr>
           <w:noProof/>
         </w:rPr>
-        <w:instrText xml:space="preserve"> PAGEREF _Toc239197431 \h </w:instrText>
+        <w:instrText xml:space="preserve"> PAGEREF _Toc239198902 \h </w:instrText>
       </w:r>
       <w:r>
         <w:rPr>
@@ -923,7 +956,7 @@
         <w:rPr>
           <w:noProof/>
         </w:rPr>
-        <w:instrText xml:space="preserve"> PAGEREF _Toc239197432 \h </w:instrText>
+        <w:instrText xml:space="preserve"> PAGEREF _Toc239198903 \h </w:instrText>
       </w:r>
       <w:r>
         <w:rPr>
@@ -981,7 +1014,7 @@
         <w:rPr>
           <w:noProof/>
         </w:rPr>
-        <w:instrText xml:space="preserve"> PAGEREF _Toc239197433 \h </w:instrText>
+        <w:instrText xml:space="preserve"> PAGEREF _Toc239198904 \h </w:instrText>
       </w:r>
       <w:r>
         <w:rPr>
@@ -1039,7 +1072,7 @@
         <w:rPr>
           <w:noProof/>
         </w:rPr>
-        <w:instrText xml:space="preserve"> PAGEREF _Toc239197434 \h </w:instrText>
+        <w:instrText xml:space="preserve"> PAGEREF _Toc239198905 \h </w:instrText>
       </w:r>
       <w:r>
         <w:rPr>
@@ -1097,7 +1130,7 @@
         <w:rPr>
           <w:noProof/>
         </w:rPr>
-        <w:instrText xml:space="preserve"> PAGEREF _Toc239197435 \h </w:instrText>
+        <w:instrText xml:space="preserve"> PAGEREF _Toc239198906 \h </w:instrText>
       </w:r>
       <w:r>
         <w:rPr>
@@ -1155,7 +1188,7 @@
         <w:rPr>
           <w:noProof/>
         </w:rPr>
-        <w:instrText xml:space="preserve"> PAGEREF _Toc239197436 \h </w:instrText>
+        <w:instrText xml:space="preserve"> PAGEREF _Toc239198907 \h </w:instrText>
       </w:r>
       <w:r>
         <w:rPr>
@@ -1213,7 +1246,7 @@
         <w:rPr>
           <w:noProof/>
         </w:rPr>
-        <w:instrText xml:space="preserve"> PAGEREF _Toc239197437 \h </w:instrText>
+        <w:instrText xml:space="preserve"> PAGEREF _Toc239198908 \h </w:instrText>
       </w:r>
       <w:r>
         <w:rPr>
@@ -1271,7 +1304,7 @@
         <w:rPr>
           <w:noProof/>
         </w:rPr>
-        <w:instrText xml:space="preserve"> PAGEREF _Toc239197438 \h </w:instrText>
+        <w:instrText xml:space="preserve"> PAGEREF _Toc239198909 \h </w:instrText>
       </w:r>
       <w:r>
         <w:rPr>
@@ -1314,7 +1347,7 @@
       <w:pPr>
         <w:pStyle w:val="Heading1"/>
       </w:pPr>
-      <w:bookmarkStart w:id="0" w:name="_Toc239197419"/>
+      <w:bookmarkStart w:id="0" w:name="_Toc239198890"/>
       <w:r>
         <w:lastRenderedPageBreak/>
         <w:t>Proposal 1: VoltStream Plumbing and Electrical (Pty) Ltd</w:t>
@@ -1325,7 +1358,7 @@
       <w:pPr>
         <w:pStyle w:val="Heading2"/>
       </w:pPr>
-      <w:bookmarkStart w:id="1" w:name="_Toc239197420"/>
+      <w:bookmarkStart w:id="1" w:name="_Toc239198891"/>
       <w:r>
         <w:t>1. Organisation Overview</w:t>
       </w:r>
@@ -1360,7 +1393,7 @@
       <w:pPr>
         <w:pStyle w:val="Heading2"/>
       </w:pPr>
-      <w:bookmarkStart w:id="2" w:name="_Toc239197421"/>
+      <w:bookmarkStart w:id="2" w:name="_Toc239198892"/>
       <w:r>
         <w:t>2. Website Goals and Objectives</w:t>
       </w:r>
@@ -1435,7 +1468,7 @@
       <w:pPr>
         <w:pStyle w:val="Heading2"/>
       </w:pPr>
-      <w:bookmarkStart w:id="3" w:name="_Toc239197422"/>
+      <w:bookmarkStart w:id="3" w:name="_Toc239198893"/>
       <w:r>
         <w:t>3. Current Website Analysis</w:t>
       </w:r>
@@ -1450,7 +1483,7 @@
       <w:pPr>
         <w:pStyle w:val="Heading2"/>
       </w:pPr>
-      <w:bookmarkStart w:id="4" w:name="_Toc239197423"/>
+      <w:bookmarkStart w:id="4" w:name="_Toc239198894"/>
       <w:r>
         <w:t>4. Proposed Website Features and Functionality</w:t>
       </w:r>
@@ -1531,7 +1564,7 @@
       <w:pPr>
         <w:pStyle w:val="Heading2"/>
       </w:pPr>
-      <w:bookmarkStart w:id="5" w:name="_Toc239197424"/>
+      <w:bookmarkStart w:id="5" w:name="_Toc239198895"/>
       <w:r>
         <w:t>5. Design and User Experience</w:t>
       </w:r>
@@ -1554,16 +1587,16 @@
         </w:rPr>
         <w:lastRenderedPageBreak/>
         <w:drawing>
-          <wp:inline distT="0" distB="0" distL="0" distR="0" wp14:anchorId="06B53C05" wp14:editId="48AFF6BD">
+          <wp:inline distT="0" distB="0" distL="0" distR="0" wp14:anchorId="214B6814" wp14:editId="7DDA39E6">
             <wp:extent cx="5731510" cy="6850380"/>
             <wp:effectExtent l="0" t="0" r="2540" b="7620"/>
-            <wp:docPr id="1861728542" name="Picture 1"/>
+            <wp:docPr id="834715704" name="Picture 1"/>
             <wp:cNvGraphicFramePr/>
             <a:graphic xmlns:a="http://schemas.openxmlformats.org/drawingml/2006/main">
               <a:graphicData uri="http://schemas.openxmlformats.org/drawingml/2006/picture">
                 <pic:pic xmlns:pic="http://schemas.openxmlformats.org/drawingml/2006/picture">
                   <pic:nvPicPr>
-                    <pic:cNvPr id="1861728542" name=""/>
+                    <pic:cNvPr id="834715704" name=""/>
                     <pic:cNvPicPr/>
                   </pic:nvPicPr>
                   <pic:blipFill>
@@ -1605,7 +1638,7 @@
       <w:pPr>
         <w:pStyle w:val="Heading2"/>
       </w:pPr>
-      <w:bookmarkStart w:id="6" w:name="_Toc239197425"/>
+      <w:bookmarkStart w:id="6" w:name="_Toc239198896"/>
       <w:r>
         <w:t>6. Technical Requirements</w:t>
       </w:r>
@@ -1663,7 +1696,7 @@
       <w:pPr>
         <w:pStyle w:val="Heading2"/>
       </w:pPr>
-      <w:bookmarkStart w:id="7" w:name="_Toc239197426"/>
+      <w:bookmarkStart w:id="7" w:name="_Toc239198897"/>
       <w:r>
         <w:lastRenderedPageBreak/>
         <w:t>7. Timeline and Milestones</w:t>
@@ -1734,7 +1767,7 @@
       <w:pPr>
         <w:pStyle w:val="Heading2"/>
       </w:pPr>
-      <w:bookmarkStart w:id="8" w:name="_Toc239197427"/>
+      <w:bookmarkStart w:id="8" w:name="_Toc239198898"/>
       <w:r>
         <w:t>8. Budget</w:t>
       </w:r>
@@ -1821,7 +1854,7 @@
       <w:pPr>
         <w:pStyle w:val="Heading2"/>
       </w:pPr>
-      <w:bookmarkStart w:id="9" w:name="_Toc239197428"/>
+      <w:bookmarkStart w:id="9" w:name="_Toc239198899"/>
       <w:r>
         <w:t>9. References</w:t>
       </w:r>
@@ -1887,7 +1920,7 @@
       <w:pPr>
         <w:pStyle w:val="Heading1"/>
       </w:pPr>
-      <w:bookmarkStart w:id="10" w:name="_Toc239197429"/>
+      <w:bookmarkStart w:id="10" w:name="_Toc239198900"/>
       <w:r>
         <w:lastRenderedPageBreak/>
         <w:t>Proposal 2: Paws of Hope Animal Shelter (NPO)</w:t>
@@ -1898,7 +1931,7 @@
       <w:pPr>
         <w:pStyle w:val="Heading2"/>
       </w:pPr>
-      <w:bookmarkStart w:id="11" w:name="_Toc239197430"/>
+      <w:bookmarkStart w:id="11" w:name="_Toc239198901"/>
       <w:r>
         <w:t>1. Organisation Overview</w:t>
       </w:r>
@@ -1933,7 +1966,7 @@
       <w:pPr>
         <w:pStyle w:val="Heading2"/>
       </w:pPr>
-      <w:bookmarkStart w:id="12" w:name="_Toc239197431"/>
+      <w:bookmarkStart w:id="12" w:name="_Toc239198902"/>
       <w:r>
         <w:t>2. Website Goals and Objectives</w:t>
       </w:r>
@@ -2008,7 +2041,7 @@
       <w:pPr>
         <w:pStyle w:val="Heading2"/>
       </w:pPr>
-      <w:bookmarkStart w:id="13" w:name="_Toc239197432"/>
+      <w:bookmarkStart w:id="13" w:name="_Toc239198903"/>
       <w:r>
         <w:t>3. Current Website Analysis</w:t>
       </w:r>
@@ -2023,7 +2056,7 @@
       <w:pPr>
         <w:pStyle w:val="Heading2"/>
       </w:pPr>
-      <w:bookmarkStart w:id="14" w:name="_Toc239197433"/>
+      <w:bookmarkStart w:id="14" w:name="_Toc239198904"/>
       <w:r>
         <w:t>4. Proposed Website Features and Functionality</w:t>
       </w:r>
@@ -2104,7 +2137,7 @@
       <w:pPr>
         <w:pStyle w:val="Heading2"/>
       </w:pPr>
-      <w:bookmarkStart w:id="15" w:name="_Toc239197434"/>
+      <w:bookmarkStart w:id="15" w:name="_Toc239198905"/>
       <w:r>
         <w:t>5. Design and User Experience</w:t>
       </w:r>
@@ -2127,16 +2160,16 @@
         </w:rPr>
         <w:lastRenderedPageBreak/>
         <w:drawing>
-          <wp:inline distT="0" distB="0" distL="0" distR="0" wp14:anchorId="4DCEB3B1" wp14:editId="49565D33">
+          <wp:inline distT="0" distB="0" distL="0" distR="0" wp14:anchorId="074CE37B" wp14:editId="6B84370F">
             <wp:extent cx="5731510" cy="6850380"/>
             <wp:effectExtent l="0" t="0" r="2540" b="7620"/>
-            <wp:docPr id="1299201199" name="Picture 2"/>
+            <wp:docPr id="1806500884" name="Picture 2"/>
             <wp:cNvGraphicFramePr/>
             <a:graphic xmlns:a="http://schemas.openxmlformats.org/drawingml/2006/main">
               <a:graphicData uri="http://schemas.openxmlformats.org/drawingml/2006/picture">
                 <pic:pic xmlns:pic="http://schemas.openxmlformats.org/drawingml/2006/picture">
                   <pic:nvPicPr>
-                    <pic:cNvPr id="1299201199" name=""/>
+                    <pic:cNvPr id="1806500884" name=""/>
                     <pic:cNvPicPr/>
                   </pic:nvPicPr>
                   <pic:blipFill>
@@ -2178,7 +2211,7 @@
       <w:pPr>
         <w:pStyle w:val="Heading2"/>
       </w:pPr>
-      <w:bookmarkStart w:id="16" w:name="_Toc239197435"/>
+      <w:bookmarkStart w:id="16" w:name="_Toc239198906"/>
       <w:r>
         <w:t>6. Technical Requirements</w:t>
       </w:r>
@@ -2248,7 +2281,7 @@
       <w:pPr>
         <w:pStyle w:val="Heading2"/>
       </w:pPr>
-      <w:bookmarkStart w:id="17" w:name="_Toc239197436"/>
+      <w:bookmarkStart w:id="17" w:name="_Toc239198907"/>
       <w:r>
         <w:lastRenderedPageBreak/>
         <w:t>7. Timeline and Milestones</w:t>
@@ -2319,7 +2352,7 @@
       <w:pPr>
         <w:pStyle w:val="Heading2"/>
       </w:pPr>
-      <w:bookmarkStart w:id="18" w:name="_Toc239197437"/>
+      <w:bookmarkStart w:id="18" w:name="_Toc239198908"/>
       <w:r>
         <w:t>8. Budget</w:t>
       </w:r>
@@ -2406,7 +2439,7 @@
       <w:pPr>
         <w:pStyle w:val="Heading2"/>
       </w:pPr>
-      <w:bookmarkStart w:id="19" w:name="_Toc239197438"/>
+      <w:bookmarkStart w:id="19" w:name="_Toc239198909"/>
       <w:r>
         <w:t>9. References</w:t>
       </w:r>
@@ -2673,7 +2706,7 @@
 <file path=word/numbering.xml><?xml version="1.0" encoding="utf-8"?>
 <w:numbering xmlns:wpc="http://schemas.microsoft.com/office/word/2010/wordprocessingCanvas" xmlns:cx="http://schemas.microsoft.com/office/drawing/2014/chartex" xmlns:cx1="http://schemas.microsoft.com/office/drawing/2015/9/8/chartex" xmlns:cx2="http://schemas.microsoft.com/office/drawing/2015/10/21/chartex" xmlns:cx3="http://schemas.microsoft.com/office/drawing/2016/5/9/chartex" xmlns:cx4="http://schemas.microsoft.com/office/drawing/2016/5/10/chartex" xmlns:cx5="http://schemas.microsoft.com/office/drawing/2016/5/11/chartex" xmlns:cx6="http://schemas.microsoft.com/office/drawing/2016/5/12/chartex" xmlns:cx7="http://schemas.microsoft.com/office/drawing/2016/5/13/chartex" xmlns:cx8="http://schemas.microsoft.com/office/drawing/2016/5/14/chartex" xmlns:mc="http://schemas.openxmlformats.org/markup-compatibility/2006" xmlns:aink="http://schemas.microsoft.com/office/drawing/2016/ink" xmlns:am3d="http://schemas.microsoft.com/office/drawing/2017/model3d" xmlns:o="urn:schemas-microsoft-com:office:office" xmlns:oel="http://schemas.microsoft.com/office/2019/extlst" xmlns:r="http://schemas.openxmlformats.org/officeDocument/2006/relationships" xmlns:m="http://schemas.openxmlformats.org/officeDocument/2006/math" xmlns:v="urn:schemas-microsoft-com:vml" xmlns:wp14="http://schemas.microsoft.com/office/word/2010/wordprocessingDrawing" xmlns:wp="http://schemas.openxmlformats.org/drawingml/2006/wordprocessingDrawing" xmlns:w10="urn:schemas-microsoft-com:office:word" xmlns:w="http://schemas.openxmlformats.org/wordprocessingml/2006/main" xmlns:w14="http://schemas.microsoft.com/office/word/2010/wordml" xmlns:w15="http://schemas.microsoft.com/office/word/2012/wordml" xmlns:w16cex="http://schemas.microsoft.com/office/word/2018/wordml/cex" xmlns:w16cid="http://schemas.microsoft.com/office/word/2016/wordml/cid" xmlns:w16="http://schemas.microsoft.com/office/word/2018/wordml" xmlns:w16du="http://schemas.microsoft.com/office/word/2023/wordml/word16du" xmlns:w16sdtdh="http://schemas.microsoft.com/office/word/2020/wordml/sdtdatahash" xmlns:w16sdtfl="http://schemas.microsoft.com/office/word/2024/wordml/sdtformatlock" xmlns:w16se="http://schemas.microsoft.com/office/word/2015/wordml/symex" xmlns:wpg="http://schemas.microsoft.com/office/word/2010/wordprocessingGroup" xmlns:wpi="http://schemas.microsoft.com/office/word/2010/wordprocessingInk" xmlns:wne="http://schemas.microsoft.com/office/word/2006/wordml" xmlns:wps="http://schemas.microsoft.com/office/word/2010/wordprocessingShape" mc:Ignorable="w14 w15 w16se w16cid w16 w16cex w16sdtdh w16sdtfl w16du wp14">
   <w:abstractNum w:abstractNumId="0" w15:restartNumberingAfterBreak="0">
-    <w:nsid w:val="0F4B4FED"/>
+    <w:nsid w:val="15772358"/>
     <w:multiLevelType w:val="singleLevel"/>
     <w:tmpl w:val="1C090001"/>
     <w:lvl w:ilvl="0">
@@ -2690,7 +2723,7 @@
     </w:lvl>
   </w:abstractNum>
   <w:abstractNum w:abstractNumId="1" w15:restartNumberingAfterBreak="0">
-    <w:nsid w:val="134F01C8"/>
+    <w:nsid w:val="1F5D6B9F"/>
     <w:multiLevelType w:val="singleLevel"/>
     <w:tmpl w:val="1C090001"/>
     <w:lvl w:ilvl="0">
@@ -2707,7 +2740,7 @@
     </w:lvl>
   </w:abstractNum>
   <w:abstractNum w:abstractNumId="2" w15:restartNumberingAfterBreak="0">
-    <w:nsid w:val="1D091C65"/>
+    <w:nsid w:val="23D56C89"/>
     <w:multiLevelType w:val="singleLevel"/>
     <w:tmpl w:val="1C090001"/>
     <w:lvl w:ilvl="0">
@@ -2724,7 +2757,7 @@
     </w:lvl>
   </w:abstractNum>
   <w:abstractNum w:abstractNumId="3" w15:restartNumberingAfterBreak="0">
-    <w:nsid w:val="1DDA737C"/>
+    <w:nsid w:val="24395DA6"/>
     <w:multiLevelType w:val="singleLevel"/>
     <w:tmpl w:val="1C090001"/>
     <w:lvl w:ilvl="0">
@@ -2741,7 +2774,7 @@
     </w:lvl>
   </w:abstractNum>
   <w:abstractNum w:abstractNumId="4" w15:restartNumberingAfterBreak="0">
-    <w:nsid w:val="232166DF"/>
+    <w:nsid w:val="261A5EEE"/>
     <w:multiLevelType w:val="singleLevel"/>
     <w:tmpl w:val="1C090001"/>
     <w:lvl w:ilvl="0">
@@ -2758,7 +2791,7 @@
     </w:lvl>
   </w:abstractNum>
   <w:abstractNum w:abstractNumId="5" w15:restartNumberingAfterBreak="0">
-    <w:nsid w:val="3E6C68C3"/>
+    <w:nsid w:val="265D77D2"/>
     <w:multiLevelType w:val="singleLevel"/>
     <w:tmpl w:val="1C090001"/>
     <w:lvl w:ilvl="0">
@@ -2775,7 +2808,7 @@
     </w:lvl>
   </w:abstractNum>
   <w:abstractNum w:abstractNumId="6" w15:restartNumberingAfterBreak="0">
-    <w:nsid w:val="42E51780"/>
+    <w:nsid w:val="28021457"/>
     <w:multiLevelType w:val="singleLevel"/>
     <w:tmpl w:val="1C090001"/>
     <w:lvl w:ilvl="0">
@@ -2792,7 +2825,7 @@
     </w:lvl>
   </w:abstractNum>
   <w:abstractNum w:abstractNumId="7" w15:restartNumberingAfterBreak="0">
-    <w:nsid w:val="634F0F43"/>
+    <w:nsid w:val="305037CF"/>
     <w:multiLevelType w:val="singleLevel"/>
     <w:tmpl w:val="1C090001"/>
     <w:lvl w:ilvl="0">
@@ -2809,7 +2842,7 @@
     </w:lvl>
   </w:abstractNum>
   <w:abstractNum w:abstractNumId="8" w15:restartNumberingAfterBreak="0">
-    <w:nsid w:val="65F52460"/>
+    <w:nsid w:val="58E62F94"/>
     <w:multiLevelType w:val="singleLevel"/>
     <w:tmpl w:val="1C090001"/>
     <w:lvl w:ilvl="0">
@@ -2826,7 +2859,7 @@
     </w:lvl>
   </w:abstractNum>
   <w:abstractNum w:abstractNumId="9" w15:restartNumberingAfterBreak="0">
-    <w:nsid w:val="6D4C4659"/>
+    <w:nsid w:val="72A21352"/>
     <w:multiLevelType w:val="singleLevel"/>
     <w:tmpl w:val="1C090001"/>
     <w:lvl w:ilvl="0">
@@ -2843,7 +2876,7 @@
     </w:lvl>
   </w:abstractNum>
   <w:abstractNum w:abstractNumId="10" w15:restartNumberingAfterBreak="0">
-    <w:nsid w:val="76085E9F"/>
+    <w:nsid w:val="76C06E47"/>
     <w:multiLevelType w:val="singleLevel"/>
     <w:tmpl w:val="1C090001"/>
     <w:lvl w:ilvl="0">
@@ -2860,7 +2893,7 @@
     </w:lvl>
   </w:abstractNum>
   <w:abstractNum w:abstractNumId="11" w15:restartNumberingAfterBreak="0">
-    <w:nsid w:val="79726982"/>
+    <w:nsid w:val="7715352C"/>
     <w:multiLevelType w:val="singleLevel"/>
     <w:tmpl w:val="1C090001"/>
     <w:lvl w:ilvl="0">
@@ -2876,41 +2909,41 @@
       </w:rPr>
     </w:lvl>
   </w:abstractNum>
-  <w:num w:numId="1" w16cid:durableId="236405142">
+  <w:num w:numId="1" w16cid:durableId="1039090873">
+    <w:abstractNumId w:val="4"/>
+  </w:num>
+  <w:num w:numId="2" w16cid:durableId="1034891400">
+    <w:abstractNumId w:val="1"/>
+  </w:num>
+  <w:num w:numId="3" w16cid:durableId="1454668021">
+    <w:abstractNumId w:val="0"/>
+  </w:num>
+  <w:num w:numId="4" w16cid:durableId="855194258">
+    <w:abstractNumId w:val="6"/>
+  </w:num>
+  <w:num w:numId="5" w16cid:durableId="906451489">
+    <w:abstractNumId w:val="11"/>
+  </w:num>
+  <w:num w:numId="6" w16cid:durableId="2100130097">
+    <w:abstractNumId w:val="5"/>
+  </w:num>
+  <w:num w:numId="7" w16cid:durableId="807162961">
+    <w:abstractNumId w:val="9"/>
+  </w:num>
+  <w:num w:numId="8" w16cid:durableId="2117751810">
+    <w:abstractNumId w:val="2"/>
+  </w:num>
+  <w:num w:numId="9" w16cid:durableId="1864395713">
+    <w:abstractNumId w:val="3"/>
+  </w:num>
+  <w:num w:numId="10" w16cid:durableId="1153136325">
     <w:abstractNumId w:val="7"/>
   </w:num>
-  <w:num w:numId="2" w16cid:durableId="952398314">
-    <w:abstractNumId w:val="11"/>
-  </w:num>
-  <w:num w:numId="3" w16cid:durableId="1674576013">
-    <w:abstractNumId w:val="6"/>
-  </w:num>
-  <w:num w:numId="4" w16cid:durableId="775366013">
-    <w:abstractNumId w:val="8"/>
-  </w:num>
-  <w:num w:numId="5" w16cid:durableId="775951638">
-    <w:abstractNumId w:val="1"/>
-  </w:num>
-  <w:num w:numId="6" w16cid:durableId="98069487">
-    <w:abstractNumId w:val="0"/>
-  </w:num>
-  <w:num w:numId="7" w16cid:durableId="426927006">
-    <w:abstractNumId w:val="9"/>
-  </w:num>
-  <w:num w:numId="8" w16cid:durableId="608271122">
-    <w:abstractNumId w:val="4"/>
-  </w:num>
-  <w:num w:numId="9" w16cid:durableId="539709279">
-    <w:abstractNumId w:val="5"/>
-  </w:num>
-  <w:num w:numId="10" w16cid:durableId="1956478870">
+  <w:num w:numId="11" w16cid:durableId="1860654255">
     <w:abstractNumId w:val="10"/>
   </w:num>
-  <w:num w:numId="11" w16cid:durableId="1744182073">
-    <w:abstractNumId w:val="3"/>
-  </w:num>
-  <w:num w:numId="12" w16cid:durableId="2114395605">
-    <w:abstractNumId w:val="2"/>
+  <w:num w:numId="12" w16cid:durableId="1201674263">
+    <w:abstractNumId w:val="8"/>
   </w:num>
 </w:numbering>
 </file>
@@ -3330,7 +3363,7 @@
     <w:link w:val="Heading1Char"/>
     <w:uiPriority w:val="9"/>
     <w:qFormat/>
-    <w:rsid w:val="002274FD"/>
+    <w:rsid w:val="00B717D0"/>
     <w:pPr>
       <w:keepNext/>
       <w:keepLines/>
@@ -3353,7 +3386,7 @@
     <w:uiPriority w:val="9"/>
     <w:unhideWhenUsed/>
     <w:qFormat/>
-    <w:rsid w:val="002274FD"/>
+    <w:rsid w:val="00B717D0"/>
     <w:pPr>
       <w:keepNext/>
       <w:keepLines/>
@@ -3377,7 +3410,7 @@
     <w:semiHidden/>
     <w:unhideWhenUsed/>
     <w:qFormat/>
-    <w:rsid w:val="002274FD"/>
+    <w:rsid w:val="00B717D0"/>
     <w:pPr>
       <w:keepNext/>
       <w:keepLines/>
@@ -3400,7 +3433,7 @@
     <w:semiHidden/>
     <w:unhideWhenUsed/>
     <w:qFormat/>
-    <w:rsid w:val="002274FD"/>
+    <w:rsid w:val="00B717D0"/>
     <w:pPr>
       <w:keepNext/>
       <w:keepLines/>
@@ -3423,7 +3456,7 @@
     <w:semiHidden/>
     <w:unhideWhenUsed/>
     <w:qFormat/>
-    <w:rsid w:val="002274FD"/>
+    <w:rsid w:val="00B717D0"/>
     <w:pPr>
       <w:keepNext/>
       <w:keepLines/>
@@ -3444,7 +3477,7 @@
     <w:semiHidden/>
     <w:unhideWhenUsed/>
     <w:qFormat/>
-    <w:rsid w:val="002274FD"/>
+    <w:rsid w:val="00B717D0"/>
     <w:pPr>
       <w:keepNext/>
       <w:keepLines/>
@@ -3467,7 +3500,7 @@
     <w:semiHidden/>
     <w:unhideWhenUsed/>
     <w:qFormat/>
-    <w:rsid w:val="002274FD"/>
+    <w:rsid w:val="00B717D0"/>
     <w:pPr>
       <w:keepNext/>
       <w:keepLines/>
@@ -3488,7 +3521,7 @@
     <w:semiHidden/>
     <w:unhideWhenUsed/>
     <w:qFormat/>
-    <w:rsid w:val="002274FD"/>
+    <w:rsid w:val="00B717D0"/>
     <w:pPr>
       <w:keepNext/>
       <w:keepLines/>
@@ -3511,7 +3544,7 @@
     <w:semiHidden/>
     <w:unhideWhenUsed/>
     <w:qFormat/>
-    <w:rsid w:val="002274FD"/>
+    <w:rsid w:val="00B717D0"/>
     <w:pPr>
       <w:keepNext/>
       <w:keepLines/>
@@ -3555,7 +3588,7 @@
     <w:basedOn w:val="DefaultParagraphFont"/>
     <w:link w:val="Heading1"/>
     <w:uiPriority w:val="9"/>
-    <w:rsid w:val="002274FD"/>
+    <w:rsid w:val="00B717D0"/>
     <w:rPr>
       <w:rFonts w:ascii="Aptos" w:eastAsiaTheme="majorEastAsia" w:hAnsi="Aptos" w:cstheme="majorBidi"/>
       <w:b/>
@@ -3569,7 +3602,7 @@
     <w:basedOn w:val="DefaultParagraphFont"/>
     <w:link w:val="Heading2"/>
     <w:uiPriority w:val="9"/>
-    <w:rsid w:val="002274FD"/>
+    <w:rsid w:val="00B717D0"/>
     <w:rPr>
       <w:rFonts w:ascii="Aptos" w:eastAsiaTheme="majorEastAsia" w:hAnsi="Aptos" w:cstheme="majorBidi"/>
       <w:b/>
@@ -3584,7 +3617,7 @@
     <w:link w:val="Heading3"/>
     <w:uiPriority w:val="9"/>
     <w:semiHidden/>
-    <w:rsid w:val="002274FD"/>
+    <w:rsid w:val="00B717D0"/>
     <w:rPr>
       <w:rFonts w:ascii="Aptos" w:eastAsiaTheme="majorEastAsia" w:hAnsi="Aptos" w:cstheme="majorBidi"/>
       <w:b/>
@@ -3599,7 +3632,7 @@
     <w:link w:val="Heading4"/>
     <w:uiPriority w:val="9"/>
     <w:semiHidden/>
-    <w:rsid w:val="002274FD"/>
+    <w:rsid w:val="00B717D0"/>
     <w:rPr>
       <w:rFonts w:eastAsiaTheme="majorEastAsia" w:cstheme="majorBidi"/>
       <w:i/>
@@ -3613,7 +3646,7 @@
     <w:link w:val="Heading5"/>
     <w:uiPriority w:val="9"/>
     <w:semiHidden/>
-    <w:rsid w:val="002274FD"/>
+    <w:rsid w:val="00B717D0"/>
     <w:rPr>
       <w:rFonts w:eastAsiaTheme="majorEastAsia" w:cstheme="majorBidi"/>
       <w:color w:val="0F4761" w:themeColor="accent1" w:themeShade="BF"/>
@@ -3625,7 +3658,7 @@
     <w:link w:val="Heading6"/>
     <w:uiPriority w:val="9"/>
     <w:semiHidden/>
-    <w:rsid w:val="002274FD"/>
+    <w:rsid w:val="00B717D0"/>
     <w:rPr>
       <w:rFonts w:eastAsiaTheme="majorEastAsia" w:cstheme="majorBidi"/>
       <w:i/>
@@ -3639,7 +3672,7 @@
     <w:link w:val="Heading7"/>
     <w:uiPriority w:val="9"/>
     <w:semiHidden/>
-    <w:rsid w:val="002274FD"/>
+    <w:rsid w:val="00B717D0"/>
     <w:rPr>
       <w:rFonts w:eastAsiaTheme="majorEastAsia" w:cstheme="majorBidi"/>
       <w:color w:val="595959" w:themeColor="text1" w:themeTint="A6"/>
@@ -3651,7 +3684,7 @@
     <w:link w:val="Heading8"/>
     <w:uiPriority w:val="9"/>
     <w:semiHidden/>
-    <w:rsid w:val="002274FD"/>
+    <w:rsid w:val="00B717D0"/>
     <w:rPr>
       <w:rFonts w:eastAsiaTheme="majorEastAsia" w:cstheme="majorBidi"/>
       <w:i/>
@@ -3665,7 +3698,7 @@
     <w:link w:val="Heading9"/>
     <w:uiPriority w:val="9"/>
     <w:semiHidden/>
-    <w:rsid w:val="002274FD"/>
+    <w:rsid w:val="00B717D0"/>
     <w:rPr>
       <w:rFonts w:eastAsiaTheme="majorEastAsia" w:cstheme="majorBidi"/>
       <w:color w:val="272727" w:themeColor="text1" w:themeTint="D8"/>
@@ -3678,7 +3711,7 @@
     <w:link w:val="TitleChar"/>
     <w:uiPriority w:val="10"/>
     <w:qFormat/>
-    <w:rsid w:val="002274FD"/>
+    <w:rsid w:val="00B717D0"/>
     <w:pPr>
       <w:spacing w:after="80" w:line="240" w:lineRule="auto"/>
       <w:contextualSpacing/>
@@ -3696,7 +3729,7 @@
     <w:basedOn w:val="DefaultParagraphFont"/>
     <w:link w:val="Title"/>
     <w:uiPriority w:val="10"/>
-    <w:rsid w:val="002274FD"/>
+    <w:rsid w:val="00B717D0"/>
     <w:rPr>
       <w:rFonts w:asciiTheme="majorHAnsi" w:eastAsiaTheme="majorEastAsia" w:hAnsiTheme="majorHAnsi" w:cstheme="majorBidi"/>
       <w:spacing w:val="-10"/>
@@ -3712,7 +3745,7 @@
     <w:link w:val="SubtitleChar"/>
     <w:uiPriority w:val="11"/>
     <w:qFormat/>
-    <w:rsid w:val="002274FD"/>
+    <w:rsid w:val="00B717D0"/>
     <w:pPr>
       <w:numPr>
         <w:ilvl w:val="1"/>
@@ -3731,7 +3764,7 @@
     <w:basedOn w:val="DefaultParagraphFont"/>
     <w:link w:val="Subtitle"/>
     <w:uiPriority w:val="11"/>
-    <w:rsid w:val="002274FD"/>
+    <w:rsid w:val="00B717D0"/>
     <w:rPr>
       <w:rFonts w:eastAsiaTheme="majorEastAsia" w:cstheme="majorBidi"/>
       <w:color w:val="595959" w:themeColor="text1" w:themeTint="A6"/>
@@ -3747,7 +3780,7 @@
     <w:link w:val="QuoteChar"/>
     <w:uiPriority w:val="29"/>
     <w:qFormat/>
-    <w:rsid w:val="002274FD"/>
+    <w:rsid w:val="00B717D0"/>
     <w:pPr>
       <w:spacing w:before="160"/>
       <w:jc w:val="center"/>
@@ -3763,7 +3796,7 @@
     <w:basedOn w:val="DefaultParagraphFont"/>
     <w:link w:val="Quote"/>
     <w:uiPriority w:val="29"/>
-    <w:rsid w:val="002274FD"/>
+    <w:rsid w:val="00B717D0"/>
     <w:rPr>
       <w:i/>
       <w:iCs/>
@@ -3775,7 +3808,7 @@
     <w:basedOn w:val="Normal"/>
     <w:uiPriority w:val="34"/>
     <w:qFormat/>
-    <w:rsid w:val="002274FD"/>
+    <w:rsid w:val="00B717D0"/>
     <w:pPr>
       <w:ind w:left="720"/>
       <w:contextualSpacing/>
@@ -3786,7 +3819,7 @@
     <w:basedOn w:val="DefaultParagraphFont"/>
     <w:uiPriority w:val="21"/>
     <w:qFormat/>
-    <w:rsid w:val="002274FD"/>
+    <w:rsid w:val="00B717D0"/>
     <w:rPr>
       <w:i/>
       <w:iCs/>
@@ -3800,7 +3833,7 @@
     <w:link w:val="IntenseQuoteChar"/>
     <w:uiPriority w:val="30"/>
     <w:qFormat/>
-    <w:rsid w:val="002274FD"/>
+    <w:rsid w:val="00B717D0"/>
     <w:pPr>
       <w:pBdr>
         <w:top w:val="single" w:sz="4" w:space="10" w:color="0F4761" w:themeColor="accent1" w:themeShade="BF"/>
@@ -3821,7 +3854,7 @@
     <w:basedOn w:val="DefaultParagraphFont"/>
     <w:link w:val="IntenseQuote"/>
     <w:uiPriority w:val="30"/>
-    <w:rsid w:val="002274FD"/>
+    <w:rsid w:val="00B717D0"/>
     <w:rPr>
       <w:i/>
       <w:iCs/>
@@ -3833,7 +3866,7 @@
     <w:basedOn w:val="DefaultParagraphFont"/>
     <w:uiPriority w:val="32"/>
     <w:qFormat/>
-    <w:rsid w:val="002274FD"/>
+    <w:rsid w:val="00B717D0"/>
     <w:rPr>
       <w:b/>
       <w:bCs/>
@@ -3849,7 +3882,7 @@
     <w:autoRedefine/>
     <w:uiPriority w:val="39"/>
     <w:unhideWhenUsed/>
-    <w:rsid w:val="002274FD"/>
+    <w:rsid w:val="00B717D0"/>
     <w:pPr>
       <w:spacing w:after="100"/>
     </w:pPr>
@@ -3861,7 +3894,7 @@
     <w:autoRedefine/>
     <w:uiPriority w:val="39"/>
     <w:unhideWhenUsed/>
-    <w:rsid w:val="002274FD"/>
+    <w:rsid w:val="00B717D0"/>
     <w:pPr>
       <w:spacing w:after="100"/>
       <w:ind w:left="220"/>
@@ -3873,7 +3906,7 @@
     <w:link w:val="HeaderChar"/>
     <w:uiPriority w:val="99"/>
     <w:unhideWhenUsed/>
-    <w:rsid w:val="002274FD"/>
+    <w:rsid w:val="00B717D0"/>
     <w:pPr>
       <w:tabs>
         <w:tab w:val="center" w:pos="4513"/>
@@ -3887,7 +3920,7 @@
     <w:basedOn w:val="DefaultParagraphFont"/>
     <w:link w:val="Header"/>
     <w:uiPriority w:val="99"/>
-    <w:rsid w:val="002274FD"/>
+    <w:rsid w:val="00B717D0"/>
     <w:rPr>
       <w:rFonts w:ascii="Aptos" w:hAnsi="Aptos"/>
       <w:sz w:val="22"/>
@@ -3899,7 +3932,7 @@
     <w:link w:val="FooterChar"/>
     <w:uiPriority w:val="99"/>
     <w:unhideWhenUsed/>
-    <w:rsid w:val="002274FD"/>
+    <w:rsid w:val="00B717D0"/>
     <w:pPr>
       <w:tabs>
         <w:tab w:val="center" w:pos="4513"/>
@@ -3913,7 +3946,7 @@
     <w:basedOn w:val="DefaultParagraphFont"/>
     <w:link w:val="Footer"/>
     <w:uiPriority w:val="99"/>
-    <w:rsid w:val="002274FD"/>
+    <w:rsid w:val="00B717D0"/>
     <w:rPr>
       <w:rFonts w:ascii="Aptos" w:hAnsi="Aptos"/>
       <w:sz w:val="22"/>
@@ -3925,7 +3958,7 @@
     <w:uiPriority w:val="99"/>
     <w:semiHidden/>
     <w:unhideWhenUsed/>
-    <w:rsid w:val="002274FD"/>
+    <w:rsid w:val="00B717D0"/>
   </w:style>
 </w:styles>
 </file>

</xml_diff>